<commit_message>
Update Understand the project background_template.docx
</commit_message>
<xml_diff>
--- a/Documents/Stages/Understand the project background/Understand the project background_template.docx
+++ b/Documents/Stages/Understand the project background/Understand the project background_template.docx
@@ -1,221 +1,1406 @@
 
 <file path=word/document.xml><?xml version="1.0" encoding="utf-8"?>
-<w:document xmlns:wpc="http://schemas.microsoft.com/office/word/2010/wordprocessingCanvas" xmlns:cx="http://schemas.microsoft.com/office/drawing/2014/chartex" xmlns:cx1="http://schemas.microsoft.com/office/drawing/2015/9/8/chartex" xmlns:cx2="http://schemas.microsoft.com/office/drawing/2015/10/21/chartex" xmlns:cx3="http://schemas.microsoft.com/office/drawing/2016/5/9/chartex" xmlns:cx4="http://schemas.microsoft.com/office/drawing/2016/5/10/chartex" xmlns:cx5="http://schemas.microsoft.com/office/drawing/2016/5/11/chartex" xmlns:cx6="http://schemas.microsoft.com/office/drawing/2016/5/12/chartex" xmlns:cx7="http://schemas.microsoft.com/office/drawing/2016/5/13/chartex" xmlns:cx8="http://schemas.microsoft.com/office/drawing/2016/5/14/chartex" xmlns:mc="http://schemas.openxmlformats.org/markup-compatibility/2006" xmlns:aink="http://schemas.microsoft.com/office/drawing/2016/ink" xmlns:am3d="http://schemas.microsoft.com/office/drawing/2017/model3d" xmlns:o="urn:schemas-microsoft-com:office:office" xmlns:oel="http://schemas.microsoft.com/office/2019/extlst" xmlns:r="http://schemas.openxmlformats.org/officeDocument/2006/relationships" xmlns:m="http://schemas.openxmlformats.org/officeDocument/2006/math" xmlns:v="urn:schemas-microsoft-com:vml" xmlns:wp14="http://schemas.microsoft.com/office/word/2010/wordprocessingDrawing" xmlns:wp="http://schemas.openxmlformats.org/drawingml/2006/wordprocessingDrawing" xmlns:w10="urn:schemas-microsoft-com:office:word" xmlns:w="http://schemas.openxmlformats.org/wordprocessingml/2006/main" xmlns:w14="http://schemas.microsoft.com/office/word/2010/wordml" xmlns:w15="http://schemas.microsoft.com/office/word/2012/wordml" xmlns:w16cei="http://schemas.microsoft.com/office/word/2026/wordml/cei" xmlns:w16cex="http://schemas.microsoft.com/office/word/2018/wordml/cex" xmlns:w16cid="http://schemas.microsoft.com/office/word/2016/wordml/cid" xmlns:w16="http://schemas.microsoft.com/office/word/2018/wordml" xmlns:w16du="http://schemas.microsoft.com/office/word/2023/wordml/word16du" xmlns:w16sdtdh="http://schemas.microsoft.com/office/word/2020/wordml/sdtdatahash" xmlns:w16sdtfl="http://schemas.microsoft.com/office/word/2024/wordml/sdtformatlock" xmlns:w16se="http://schemas.microsoft.com/office/word/2015/wordml/symex" xmlns:wpg="http://schemas.microsoft.com/office/word/2010/wordprocessingGroup" xmlns:wpi="http://schemas.microsoft.com/office/word/2010/wordprocessingInk" xmlns:wne="http://schemas.microsoft.com/office/word/2006/wordml" xmlns:wps="http://schemas.microsoft.com/office/word/2010/wordprocessingShape" mc:Ignorable="w14 w15 w16se w16cid w16 w16cex w16sdtdh w16sdtfl w16du wp14">
+<w:document xmlns:wpc="http://schemas.microsoft.com/office/word/2010/wordprocessingCanvas" xmlns:cx="http://schemas.microsoft.com/office/drawing/2014/chartex" xmlns:cx1="http://schemas.microsoft.com/office/drawing/2015/9/8/chartex" xmlns:cx2="http://schemas.microsoft.com/office/drawing/2015/10/21/chartex" xmlns:cx3="http://schemas.microsoft.com/office/drawing/2016/5/9/chartex" xmlns:cx4="http://schemas.microsoft.com/office/drawing/2016/5/10/chartex" xmlns:cx5="http://schemas.microsoft.com/office/drawing/2016/5/11/chartex" xmlns:cx6="http://schemas.microsoft.com/office/drawing/2016/5/12/chartex" xmlns:cx7="http://schemas.microsoft.com/office/drawing/2016/5/13/chartex" xmlns:cx8="http://schemas.microsoft.com/office/drawing/2016/5/14/chartex" xmlns:mc="http://schemas.openxmlformats.org/markup-compatibility/2006" xmlns:aink="http://schemas.microsoft.com/office/drawing/2016/ink" xmlns:am3d="http://schemas.microsoft.com/office/drawing/2017/model3d" xmlns:o="urn:schemas-microsoft-com:office:office" xmlns:oel="http://schemas.microsoft.com/office/2019/extlst" xmlns:r="http://schemas.openxmlformats.org/officeDocument/2006/relationships" xmlns:m="http://schemas.openxmlformats.org/officeDocument/2006/math" xmlns:v="urn:schemas-microsoft-com:vml" xmlns:wp14="http://schemas.microsoft.com/office/word/2010/wordprocessingDrawing" xmlns:wp="http://schemas.openxmlformats.org/drawingml/2006/wordprocessingDrawing" xmlns:w10="urn:schemas-microsoft-com:office:word" xmlns:w="http://schemas.openxmlformats.org/wordprocessingml/2006/main" xmlns:w14="http://schemas.microsoft.com/office/word/2010/wordml" xmlns:w15="http://schemas.microsoft.com/office/word/2012/wordml" xmlns:w16cex="http://schemas.microsoft.com/office/word/2018/wordml/cex" xmlns:w16cid="http://schemas.microsoft.com/office/word/2016/wordml/cid" xmlns:w16="http://schemas.microsoft.com/office/word/2018/wordml" xmlns:w16du="http://schemas.microsoft.com/office/word/2023/wordml/word16du" xmlns:w16sdtdh="http://schemas.microsoft.com/office/word/2020/wordml/sdtdatahash" xmlns:w16sdtfl="http://schemas.microsoft.com/office/word/2024/wordml/sdtformatlock" xmlns:w16se="http://schemas.microsoft.com/office/word/2015/wordml/symex" xmlns:wpg="http://schemas.microsoft.com/office/word/2010/wordprocessingGroup" xmlns:wpi="http://schemas.microsoft.com/office/word/2010/wordprocessingInk" xmlns:wne="http://schemas.microsoft.com/office/word/2006/wordml" xmlns:wps="http://schemas.microsoft.com/office/word/2010/wordprocessingShape" mc:Ignorable="w14 w15 w16se w16cid w16 w16cex w16sdtdh w16sdtfl w16du wp14">
   <w:body>
     <w:p>
-      <w:pPr>
-        <w:pStyle w:val="Heading1"/>
-      </w:pPr>
-      <w:r>
-        <w:t>Understand the project background</w:t>
-      </w:r>
-    </w:p>
-    <w:p>
-      <w:pPr>
-        <w:jc w:val="both"/>
-      </w:pPr>
-      <w:r>
-        <w:t>First, determine why the project exists.</w:t>
-      </w:r>
-    </w:p>
-    <w:p>
-      <w:pPr>
-        <w:pStyle w:val="Heading2"/>
-      </w:pPr>
-      <w:r>
-        <w:t>You need to understand:</w:t>
-      </w:r>
-    </w:p>
-    <w:p>
-      <w:pPr>
-        <w:numPr>
-          <w:ilvl w:val="0"/>
-          <w:numId w:val="1"/>
-        </w:numPr>
-        <w:jc w:val="both"/>
-      </w:pPr>
-      <w:r>
-        <w:t>What type of gym is involved.</w:t>
-      </w:r>
-    </w:p>
-    <w:p>
-      <w:pPr>
-        <w:numPr>
-          <w:ilvl w:val="0"/>
-          <w:numId w:val="1"/>
-        </w:numPr>
-        <w:jc w:val="both"/>
-      </w:pPr>
-      <w:r>
-        <w:t>How many branches it has.</w:t>
-      </w:r>
-    </w:p>
-    <w:p>
-      <w:pPr>
-        <w:numPr>
-          <w:ilvl w:val="0"/>
-          <w:numId w:val="1"/>
-        </w:numPr>
-        <w:jc w:val="both"/>
-      </w:pPr>
-      <w:r>
-        <w:t>How many staff members, customers, and personal trainers use it.</w:t>
-      </w:r>
-    </w:p>
-    <w:p>
-      <w:pPr>
-        <w:numPr>
-          <w:ilvl w:val="0"/>
-          <w:numId w:val="1"/>
-        </w:numPr>
-        <w:jc w:val="both"/>
-      </w:pPr>
-      <w:r>
-        <w:t>How the gym currently operates.</w:t>
-      </w:r>
-    </w:p>
-    <w:p>
-      <w:pPr>
-        <w:numPr>
-          <w:ilvl w:val="0"/>
-          <w:numId w:val="1"/>
-        </w:numPr>
-        <w:jc w:val="both"/>
-      </w:pPr>
-      <w:r>
-        <w:t>Why the customer wants a new system.</w:t>
-      </w:r>
-    </w:p>
-    <w:p>
-      <w:pPr>
-        <w:numPr>
-          <w:ilvl w:val="0"/>
-          <w:numId w:val="1"/>
-        </w:numPr>
-        <w:jc w:val="both"/>
-      </w:pPr>
-      <w:r>
-        <w:t>What results they expect from the project.</w:t>
-      </w:r>
-    </w:p>
-    <w:p>
-      <w:pPr>
-        <w:jc w:val="both"/>
-      </w:pPr>
-      <w:r>
-        <w:t>At this stage, do not discuss detailed screens or database tables.</w:t>
-      </w:r>
-    </w:p>
-    <w:p>
-      <w:pPr>
-        <w:pStyle w:val="Heading2"/>
-      </w:pPr>
-      <w:r>
-        <w:t>Your main questions are:</w:t>
-      </w:r>
-    </w:p>
-    <w:p>
-      <w:pPr>
-        <w:numPr>
-          <w:ilvl w:val="0"/>
-          <w:numId w:val="2"/>
-        </w:numPr>
-        <w:jc w:val="both"/>
-      </w:pPr>
-      <w:r>
-        <w:t>Why is this system needed?</w:t>
-      </w:r>
-    </w:p>
-    <w:p>
-      <w:pPr>
-        <w:numPr>
-          <w:ilvl w:val="0"/>
-          <w:numId w:val="2"/>
-        </w:numPr>
-        <w:jc w:val="both"/>
-      </w:pPr>
-      <w:r>
-        <w:t>What is currently difficult?</w:t>
-      </w:r>
-    </w:p>
-    <w:p>
-      <w:pPr>
-        <w:numPr>
-          <w:ilvl w:val="0"/>
-          <w:numId w:val="2"/>
-        </w:numPr>
-        <w:jc w:val="both"/>
-      </w:pPr>
-      <w:r>
-        <w:t>What business result should improve?</w:t>
-      </w:r>
-    </w:p>
-    <w:p>
-      <w:pPr>
-        <w:numPr>
-          <w:ilvl w:val="0"/>
-          <w:numId w:val="2"/>
-        </w:numPr>
-        <w:jc w:val="both"/>
-      </w:pPr>
-      <w:r>
-        <w:t>What happens if the current process remains unchanged?</w:t>
-      </w:r>
-    </w:p>
-    <w:p>
-      <w:pPr>
-        <w:pStyle w:val="Heading2"/>
-      </w:pPr>
-      <w:r>
-        <w:t>Output:</w:t>
-      </w:r>
-    </w:p>
-    <w:p>
-      <w:pPr>
-        <w:numPr>
-          <w:ilvl w:val="0"/>
-          <w:numId w:val="3"/>
-        </w:numPr>
-        <w:jc w:val="both"/>
-      </w:pPr>
-      <w:r>
-        <w:t>Project background</w:t>
-      </w:r>
-    </w:p>
-    <w:p>
-      <w:pPr>
-        <w:numPr>
-          <w:ilvl w:val="0"/>
-          <w:numId w:val="3"/>
-        </w:numPr>
-        <w:jc w:val="both"/>
-      </w:pPr>
-      <w:r>
-        <w:t>Initial problem statement</w:t>
-      </w:r>
-    </w:p>
-    <w:p>
-      <w:pPr>
-        <w:numPr>
-          <w:ilvl w:val="0"/>
-          <w:numId w:val="3"/>
-        </w:numPr>
-        <w:jc w:val="both"/>
-      </w:pPr>
-      <w:r>
-        <w:t>Initial business objectives</w:t>
-      </w:r>
-    </w:p>
-    <w:p>
-      <w:pPr>
-        <w:numPr>
-          <w:ilvl w:val="0"/>
-          <w:numId w:val="3"/>
-        </w:numPr>
-        <w:jc w:val="both"/>
-      </w:pPr>
-      <w:r>
-        <w:t>List of assumptions and unanswered questions</w:t>
+      <w:r>
+        <w:t>GYM MANAGEMENT SYSTEM</w:t>
+      </w:r>
+    </w:p>
+    <w:p/>
+    <w:p>
+      <w:r>
+        <w:t>UNDERSTAND THE PROJECT BACKGROUND</w:t>
+      </w:r>
+    </w:p>
+    <w:p/>
+    <w:p>
+      <w:r>
+        <w:t>Document Version: 1.0</w:t>
+      </w:r>
+    </w:p>
+    <w:p>
+      <w:r>
+        <w:t>Status: Draft</w:t>
+      </w:r>
+    </w:p>
+    <w:p>
+      <w:r>
+        <w:t>Prepared by: [Tên người thực hiện]</w:t>
+      </w:r>
+    </w:p>
+    <w:p>
+      <w:r>
+        <w:t>Date: 03/08/2026</w:t>
+      </w:r>
+      <w:r>
+        <w:t>S</w:t>
+      </w:r>
+    </w:p>
+    <w:p/>
+    <w:p>
+      <w:pPr>
+        <w:pStyle w:val="Heading3"/>
+        <w:rPr>
+          <w:noProof w:val="0"/>
+        </w:rPr>
+      </w:pPr>
+      <w:r>
+        <w:t>1. Project Background</w:t>
+      </w:r>
+    </w:p>
+    <w:p>
+      <w:pPr>
+        <w:pStyle w:val="NormalWeb"/>
+      </w:pPr>
+      <w:r>
+        <w:t>The Gym Management System project is initiated to study and improve the operational management of a gym business. The proposed system is expected to support account management, gym equipment management, customer training schedules, customer training journeys, interactions between personal trainers and customers, online payments, user communication, and user evaluations.</w:t>
+      </w:r>
+    </w:p>
+    <w:p>
+      <w:pPr>
+        <w:pStyle w:val="NormalWeb"/>
+      </w:pPr>
+      <w:r>
+        <w:t>At the current discovery stage, detailed information about the type of gym, number of branches, number of employees, customers, and personal trainers has not yet been confirmed. The current operational process and the software or tools being used must also be investigated through stakeholder interviews.</w:t>
+      </w:r>
+    </w:p>
+    <w:p>
+      <w:pPr>
+        <w:pStyle w:val="NormalWeb"/>
+      </w:pPr>
+      <w:r>
+        <w:t>The project will initially focus on a web-based application. Gmail notifications and QR payments through MoMo are being considered as external integrations. The feasibility and scope of a mobile application have not yet been finalized.</w:t>
+      </w:r>
+    </w:p>
+    <w:p>
+      <w:pPr>
+        <w:pStyle w:val="NormalWeb"/>
+      </w:pPr>
+      <w:r>
+        <w:t>This stage focuses on understanding the business situation and the reason the project is needed. Detailed user interfaces, database structures, and technical implementation decisions are outside the scope of this document.</w:t>
+      </w:r>
+    </w:p>
+    <w:p>
+      <w:pPr>
+        <w:pStyle w:val="NormalWeb"/>
+      </w:pPr>
+      <w:r>
+        <w:t>Đoạn này chỉ ghi các thông tin hiện đã biết và nói rõ những thông tin chưa được xác nhận, tránh tự bịa số liệu.</w:t>
+      </w:r>
+    </w:p>
+    <w:p>
+      <w:r>
+        <w:pict w14:anchorId="54EB896F">
+          <v:rect id="_x0000_i1025" style="width:0;height:1.5pt" o:hralign="center" o:hrstd="t" o:hr="t" fillcolor="#a0a0a0" stroked="f"/>
+        </w:pict>
+      </w:r>
+    </w:p>
+    <w:p>
+      <w:pPr>
+        <w:pStyle w:val="Heading3"/>
+      </w:pPr>
+      <w:r>
+        <w:t>2. Initial Problem Statement</w:t>
+      </w:r>
+    </w:p>
+    <w:p>
+      <w:pPr>
+        <w:pStyle w:val="NormalWeb"/>
+      </w:pPr>
+      <w:r>
+        <w:t>The gym may currently depend on manual procedures, spreadsheets, messaging applications, or disconnected software tools to manage customers, staff members, personal trainers, equipment, training schedules, payments, and customer progress.</w:t>
+      </w:r>
+    </w:p>
+    <w:p>
+      <w:pPr>
+        <w:pStyle w:val="NormalWeb"/>
+      </w:pPr>
+      <w:r>
+        <w:lastRenderedPageBreak/>
+        <w:t>Because the current operational process has not yet been fully investigated, the following problems are treated as initial hypotheses that must be validated with the gym owner and staff:</w:t>
+      </w:r>
+    </w:p>
+    <w:p>
+      <w:pPr>
+        <w:numPr>
+          <w:ilvl w:val="0"/>
+          <w:numId w:val="4"/>
+        </w:numPr>
+        <w:spacing w:before="100" w:beforeAutospacing="1" w:after="100" w:afterAutospacing="1" w:line="240" w:lineRule="auto"/>
+      </w:pPr>
+      <w:r>
+        <w:t xml:space="preserve">Customer, staff, personal trainer, and equipment information may be stored in separate locations. </w:t>
+      </w:r>
+    </w:p>
+    <w:p>
+      <w:pPr>
+        <w:numPr>
+          <w:ilvl w:val="0"/>
+          <w:numId w:val="4"/>
+        </w:numPr>
+        <w:spacing w:before="100" w:beforeAutospacing="1" w:after="100" w:afterAutospacing="1" w:line="240" w:lineRule="auto"/>
+      </w:pPr>
+      <w:r>
+        <w:t xml:space="preserve">Staff may spend excessive time searching for and updating information. </w:t>
+      </w:r>
+    </w:p>
+    <w:p>
+      <w:pPr>
+        <w:numPr>
+          <w:ilvl w:val="0"/>
+          <w:numId w:val="4"/>
+        </w:numPr>
+        <w:spacing w:before="100" w:beforeAutospacing="1" w:after="100" w:afterAutospacing="1" w:line="240" w:lineRule="auto"/>
+      </w:pPr>
+      <w:r>
+        <w:t xml:space="preserve">Training schedules may be difficult to coordinate between customers and personal trainers. </w:t>
+      </w:r>
+    </w:p>
+    <w:p>
+      <w:pPr>
+        <w:numPr>
+          <w:ilvl w:val="0"/>
+          <w:numId w:val="4"/>
+        </w:numPr>
+        <w:spacing w:before="100" w:beforeAutospacing="1" w:after="100" w:afterAutospacing="1" w:line="240" w:lineRule="auto"/>
+      </w:pPr>
+      <w:r>
+        <w:t xml:space="preserve">The gym may lack a centralized record of each customer's training journey and progress. </w:t>
+      </w:r>
+    </w:p>
+    <w:p>
+      <w:pPr>
+        <w:numPr>
+          <w:ilvl w:val="0"/>
+          <w:numId w:val="4"/>
+        </w:numPr>
+        <w:spacing w:before="100" w:beforeAutospacing="1" w:after="100" w:afterAutospacing="1" w:line="240" w:lineRule="auto"/>
+      </w:pPr>
+      <w:r>
+        <w:t xml:space="preserve">Payment status and membership information may not be updated consistently. </w:t>
+      </w:r>
+    </w:p>
+    <w:p>
+      <w:pPr>
+        <w:numPr>
+          <w:ilvl w:val="0"/>
+          <w:numId w:val="4"/>
+        </w:numPr>
+        <w:spacing w:before="100" w:beforeAutospacing="1" w:after="100" w:afterAutospacing="1" w:line="240" w:lineRule="auto"/>
+      </w:pPr>
+      <w:r>
+        <w:t xml:space="preserve">Communication between customers, personal trainers, and gym staff may depend on external messaging applications. </w:t>
+      </w:r>
+    </w:p>
+    <w:p>
+      <w:pPr>
+        <w:numPr>
+          <w:ilvl w:val="0"/>
+          <w:numId w:val="4"/>
+        </w:numPr>
+        <w:spacing w:before="100" w:beforeAutospacing="1" w:after="100" w:afterAutospacing="1" w:line="240" w:lineRule="auto"/>
+      </w:pPr>
+      <w:r>
+        <w:t xml:space="preserve">Managers may lack timely and reliable reports for operational decisions. </w:t>
+      </w:r>
+    </w:p>
+    <w:p>
+      <w:pPr>
+        <w:pStyle w:val="NormalWeb"/>
+      </w:pPr>
+      <w:r>
+        <w:t>If the current process remains unchanged, the gym may continue experiencing duplicated data, processing delays, scheduling conflicts, limited operational visibility, and difficulties when expanding its customer base or opening additional branches.</w:t>
+      </w:r>
+    </w:p>
+    <w:p>
+      <w:r>
+        <w:pict w14:anchorId="6B045B63">
+          <v:rect id="_x0000_i1026" style="width:0;height:1.5pt" o:hralign="center" o:hrstd="t" o:hr="t" fillcolor="#a0a0a0" stroked="f"/>
+        </w:pict>
+      </w:r>
+    </w:p>
+    <w:p>
+      <w:pPr>
+        <w:pStyle w:val="Heading3"/>
+      </w:pPr>
+      <w:r>
+        <w:t>3. Initial Business Objectives</w:t>
+      </w:r>
+    </w:p>
+    <w:p>
+      <w:pPr>
+        <w:pStyle w:val="NormalWeb"/>
+      </w:pPr>
+      <w:r>
+        <w:t>The initial business objectives of the Gym Management System are:</w:t>
+      </w:r>
+    </w:p>
+    <w:p>
+      <w:pPr>
+        <w:numPr>
+          <w:ilvl w:val="0"/>
+          <w:numId w:val="5"/>
+        </w:numPr>
+        <w:spacing w:before="100" w:beforeAutospacing="1" w:after="100" w:afterAutospacing="1" w:line="240" w:lineRule="auto"/>
+      </w:pPr>
+      <w:r>
+        <w:t xml:space="preserve">Centralize information about customers, staff members, personal trainers, gym equipment, memberships, schedules, and payments. </w:t>
+      </w:r>
+    </w:p>
+    <w:p>
+      <w:pPr>
+        <w:numPr>
+          <w:ilvl w:val="0"/>
+          <w:numId w:val="5"/>
+        </w:numPr>
+        <w:spacing w:before="100" w:beforeAutospacing="1" w:after="100" w:afterAutospacing="1" w:line="240" w:lineRule="auto"/>
+      </w:pPr>
+      <w:r>
+        <w:t xml:space="preserve">Reduce the amount of manual work required for daily gym operations. </w:t>
+      </w:r>
+    </w:p>
+    <w:p>
+      <w:pPr>
+        <w:numPr>
+          <w:ilvl w:val="0"/>
+          <w:numId w:val="5"/>
+        </w:numPr>
+        <w:spacing w:before="100" w:beforeAutospacing="1" w:after="100" w:afterAutospacing="1" w:line="240" w:lineRule="auto"/>
+      </w:pPr>
+      <w:r>
+        <w:t xml:space="preserve">Improve the accuracy and consistency of operational information. </w:t>
+      </w:r>
+    </w:p>
+    <w:p>
+      <w:pPr>
+        <w:numPr>
+          <w:ilvl w:val="0"/>
+          <w:numId w:val="5"/>
+        </w:numPr>
+        <w:spacing w:before="100" w:beforeAutospacing="1" w:after="100" w:afterAutospacing="1" w:line="240" w:lineRule="auto"/>
+      </w:pPr>
+      <w:r>
+        <w:t xml:space="preserve">Improve coordination of training schedules between customers and personal trainers. </w:t>
+      </w:r>
+    </w:p>
+    <w:p>
+      <w:pPr>
+        <w:numPr>
+          <w:ilvl w:val="0"/>
+          <w:numId w:val="5"/>
+        </w:numPr>
+        <w:spacing w:before="100" w:beforeAutospacing="1" w:after="100" w:afterAutospacing="1" w:line="240" w:lineRule="auto"/>
+      </w:pPr>
+      <w:r>
+        <w:t xml:space="preserve">Provide a clear record of each customer's training journey and progress. </w:t>
+      </w:r>
+    </w:p>
+    <w:p>
+      <w:pPr>
+        <w:numPr>
+          <w:ilvl w:val="0"/>
+          <w:numId w:val="5"/>
+        </w:numPr>
+        <w:spacing w:before="100" w:beforeAutospacing="1" w:after="100" w:afterAutospacing="1" w:line="240" w:lineRule="auto"/>
+      </w:pPr>
+      <w:r>
+        <w:t xml:space="preserve">Support online payment through QR-based payment methods such as MoMo. </w:t>
+      </w:r>
+    </w:p>
+    <w:p>
+      <w:pPr>
+        <w:numPr>
+          <w:ilvl w:val="0"/>
+          <w:numId w:val="5"/>
+        </w:numPr>
+        <w:spacing w:before="100" w:beforeAutospacing="1" w:after="100" w:afterAutospacing="1" w:line="240" w:lineRule="auto"/>
+      </w:pPr>
+      <w:r>
+        <w:t xml:space="preserve">Support automated Gmail notifications for important events and reminders. </w:t>
+      </w:r>
+    </w:p>
+    <w:p>
+      <w:pPr>
+        <w:numPr>
+          <w:ilvl w:val="0"/>
+          <w:numId w:val="5"/>
+        </w:numPr>
+        <w:spacing w:before="100" w:beforeAutospacing="1" w:after="100" w:afterAutospacing="1" w:line="240" w:lineRule="auto"/>
+      </w:pPr>
+      <w:r>
+        <w:t xml:space="preserve">Improve communication between system users. </w:t>
+      </w:r>
+    </w:p>
+    <w:p>
+      <w:pPr>
+        <w:numPr>
+          <w:ilvl w:val="0"/>
+          <w:numId w:val="5"/>
+        </w:numPr>
+        <w:spacing w:before="100" w:beforeAutospacing="1" w:after="100" w:afterAutospacing="1" w:line="240" w:lineRule="auto"/>
+      </w:pPr>
+      <w:r>
+        <w:t xml:space="preserve">Provide management reports that support business monitoring and decision-making. </w:t>
+      </w:r>
+    </w:p>
+    <w:p>
+      <w:pPr>
+        <w:numPr>
+          <w:ilvl w:val="0"/>
+          <w:numId w:val="5"/>
+        </w:numPr>
+        <w:spacing w:before="100" w:beforeAutospacing="1" w:after="100" w:afterAutospacing="1" w:line="240" w:lineRule="auto"/>
+      </w:pPr>
+      <w:r>
+        <w:t xml:space="preserve">Create a system foundation that can support future growth or additional gym branches. </w:t>
+      </w:r>
+    </w:p>
+    <w:p>
+      <w:pPr>
+        <w:pStyle w:val="NormalWeb"/>
+      </w:pPr>
+      <w:r>
+        <w:t>Specific targets, such as expected processing-time reduction, schedule-conflict reduction, number of users, and system adoption rate, will be established after stakeholder interviews and analysis of the current process.</w:t>
+      </w:r>
+    </w:p>
+    <w:p>
+      <w:r>
+        <w:pict w14:anchorId="2132CCAB">
+          <v:rect id="_x0000_i1027" style="width:0;height:1.5pt" o:hralign="center" o:hrstd="t" o:hr="t" fillcolor="#a0a0a0" stroked="f"/>
+        </w:pict>
+      </w:r>
+    </w:p>
+    <w:p>
+      <w:pPr>
+        <w:pStyle w:val="Heading3"/>
+      </w:pPr>
+      <w:r>
+        <w:t>4. Assumptions</w:t>
+      </w:r>
+    </w:p>
+    <w:p>
+      <w:pPr>
+        <w:pStyle w:val="NormalWeb"/>
+      </w:pPr>
+      <w:r>
+        <w:t>Điền dưới dạng bảng:</w:t>
+      </w:r>
+    </w:p>
+    <w:tbl>
+      <w:tblPr>
+        <w:tblW w:w="0" w:type="auto"/>
+        <w:tblCellSpacing w:w="15" w:type="dxa"/>
+        <w:tblCellMar>
+          <w:top w:w="15" w:type="dxa"/>
+          <w:left w:w="15" w:type="dxa"/>
+          <w:bottom w:w="15" w:type="dxa"/>
+          <w:right w:w="15" w:type="dxa"/>
+        </w:tblCellMar>
+        <w:tblLook w:val="04A0" w:firstRow="1" w:lastRow="0" w:firstColumn="1" w:lastColumn="0" w:noHBand="0" w:noVBand="1"/>
+      </w:tblPr>
+      <w:tblGrid>
+        <w:gridCol w:w="520"/>
+        <w:gridCol w:w="4902"/>
+        <w:gridCol w:w="3938"/>
+      </w:tblGrid>
+      <w:tr>
+        <w:trPr>
+          <w:tblHeader/>
+          <w:tblCellSpacing w:w="15" w:type="dxa"/>
+        </w:trPr>
+        <w:tc>
+          <w:tcPr>
+            <w:tcW w:w="0" w:type="auto"/>
+            <w:vAlign w:val="center"/>
+            <w:hideMark/>
+          </w:tcPr>
+          <w:p>
+            <w:pPr>
+              <w:jc w:val="center"/>
+              <w:rPr>
+                <w:b/>
+                <w:bCs/>
+              </w:rPr>
+            </w:pPr>
+            <w:r>
+              <w:rPr>
+                <w:b/>
+                <w:bCs/>
+              </w:rPr>
+              <w:lastRenderedPageBreak/>
+              <w:t>ID</w:t>
+            </w:r>
+          </w:p>
+        </w:tc>
+        <w:tc>
+          <w:tcPr>
+            <w:tcW w:w="0" w:type="auto"/>
+            <w:vAlign w:val="center"/>
+            <w:hideMark/>
+          </w:tcPr>
+          <w:p>
+            <w:pPr>
+              <w:jc w:val="center"/>
+              <w:rPr>
+                <w:b/>
+                <w:bCs/>
+              </w:rPr>
+            </w:pPr>
+            <w:r>
+              <w:rPr>
+                <w:b/>
+                <w:bCs/>
+              </w:rPr>
+              <w:t>Initial assumption</w:t>
+            </w:r>
+          </w:p>
+        </w:tc>
+        <w:tc>
+          <w:tcPr>
+            <w:tcW w:w="0" w:type="auto"/>
+            <w:vAlign w:val="center"/>
+            <w:hideMark/>
+          </w:tcPr>
+          <w:p>
+            <w:pPr>
+              <w:jc w:val="center"/>
+              <w:rPr>
+                <w:b/>
+                <w:bCs/>
+              </w:rPr>
+            </w:pPr>
+            <w:r>
+              <w:rPr>
+                <w:b/>
+                <w:bCs/>
+              </w:rPr>
+              <w:t>Validation method</w:t>
+            </w:r>
+          </w:p>
+        </w:tc>
+      </w:tr>
+      <w:tr>
+        <w:trPr>
+          <w:tblCellSpacing w:w="15" w:type="dxa"/>
+        </w:trPr>
+        <w:tc>
+          <w:tcPr>
+            <w:tcW w:w="0" w:type="auto"/>
+            <w:vAlign w:val="center"/>
+            <w:hideMark/>
+          </w:tcPr>
+          <w:p>
+            <w:r>
+              <w:t>AS-01</w:t>
+            </w:r>
+          </w:p>
+        </w:tc>
+        <w:tc>
+          <w:tcPr>
+            <w:tcW w:w="0" w:type="auto"/>
+            <w:vAlign w:val="center"/>
+            <w:hideMark/>
+          </w:tcPr>
+          <w:p>
+            <w:r>
+              <w:t>The gym currently uses manual or partially digital management processes.</w:t>
+            </w:r>
+          </w:p>
+        </w:tc>
+        <w:tc>
+          <w:tcPr>
+            <w:tcW w:w="0" w:type="auto"/>
+            <w:vAlign w:val="center"/>
+            <w:hideMark/>
+          </w:tcPr>
+          <w:p>
+            <w:r>
+              <w:t>Interview the owner and staff.</w:t>
+            </w:r>
+          </w:p>
+        </w:tc>
+      </w:tr>
+      <w:tr>
+        <w:trPr>
+          <w:tblCellSpacing w:w="15" w:type="dxa"/>
+        </w:trPr>
+        <w:tc>
+          <w:tcPr>
+            <w:tcW w:w="0" w:type="auto"/>
+            <w:vAlign w:val="center"/>
+            <w:hideMark/>
+          </w:tcPr>
+          <w:p>
+            <w:r>
+              <w:t>AS-02</w:t>
+            </w:r>
+          </w:p>
+        </w:tc>
+        <w:tc>
+          <w:tcPr>
+            <w:tcW w:w="0" w:type="auto"/>
+            <w:vAlign w:val="center"/>
+            <w:hideMark/>
+          </w:tcPr>
+          <w:p>
+            <w:r>
+              <w:t>The system will support multiple user roles.</w:t>
+            </w:r>
+          </w:p>
+        </w:tc>
+        <w:tc>
+          <w:tcPr>
+            <w:tcW w:w="0" w:type="auto"/>
+            <w:vAlign w:val="center"/>
+            <w:hideMark/>
+          </w:tcPr>
+          <w:p>
+            <w:r>
+              <w:t>Confirm the stakeholder and role list.</w:t>
+            </w:r>
+          </w:p>
+        </w:tc>
+      </w:tr>
+      <w:tr>
+        <w:trPr>
+          <w:tblCellSpacing w:w="15" w:type="dxa"/>
+        </w:trPr>
+        <w:tc>
+          <w:tcPr>
+            <w:tcW w:w="0" w:type="auto"/>
+            <w:vAlign w:val="center"/>
+            <w:hideMark/>
+          </w:tcPr>
+          <w:p>
+            <w:r>
+              <w:t>AS-03</w:t>
+            </w:r>
+          </w:p>
+        </w:tc>
+        <w:tc>
+          <w:tcPr>
+            <w:tcW w:w="0" w:type="auto"/>
+            <w:vAlign w:val="center"/>
+            <w:hideMark/>
+          </w:tcPr>
+          <w:p>
+            <w:r>
+              <w:t>The web application will be the primary platform.</w:t>
+            </w:r>
+          </w:p>
+        </w:tc>
+        <w:tc>
+          <w:tcPr>
+            <w:tcW w:w="0" w:type="auto"/>
+            <w:vAlign w:val="center"/>
+            <w:hideMark/>
+          </w:tcPr>
+          <w:p>
+            <w:r>
+              <w:t>Confirm the approved project scope.</w:t>
+            </w:r>
+          </w:p>
+        </w:tc>
+      </w:tr>
+      <w:tr>
+        <w:trPr>
+          <w:tblCellSpacing w:w="15" w:type="dxa"/>
+        </w:trPr>
+        <w:tc>
+          <w:tcPr>
+            <w:tcW w:w="0" w:type="auto"/>
+            <w:vAlign w:val="center"/>
+            <w:hideMark/>
+          </w:tcPr>
+          <w:p>
+            <w:r>
+              <w:t>AS-04</w:t>
+            </w:r>
+          </w:p>
+        </w:tc>
+        <w:tc>
+          <w:tcPr>
+            <w:tcW w:w="0" w:type="auto"/>
+            <w:vAlign w:val="center"/>
+            <w:hideMark/>
+          </w:tcPr>
+          <w:p>
+            <w:r>
+              <w:t>Customers may access personal schedules and training progress.</w:t>
+            </w:r>
+          </w:p>
+        </w:tc>
+        <w:tc>
+          <w:tcPr>
+            <w:tcW w:w="0" w:type="auto"/>
+            <w:vAlign w:val="center"/>
+            <w:hideMark/>
+          </w:tcPr>
+          <w:p>
+            <w:r>
+              <w:t>Interview customers and personal trainers.</w:t>
+            </w:r>
+          </w:p>
+        </w:tc>
+      </w:tr>
+      <w:tr>
+        <w:trPr>
+          <w:tblCellSpacing w:w="15" w:type="dxa"/>
+        </w:trPr>
+        <w:tc>
+          <w:tcPr>
+            <w:tcW w:w="0" w:type="auto"/>
+            <w:vAlign w:val="center"/>
+            <w:hideMark/>
+          </w:tcPr>
+          <w:p>
+            <w:r>
+              <w:t>AS-05</w:t>
+            </w:r>
+          </w:p>
+        </w:tc>
+        <w:tc>
+          <w:tcPr>
+            <w:tcW w:w="0" w:type="auto"/>
+            <w:vAlign w:val="center"/>
+            <w:hideMark/>
+          </w:tcPr>
+          <w:p>
+            <w:r>
+              <w:t>Personal trainers will manage assigned customers and training progress.</w:t>
+            </w:r>
+          </w:p>
+        </w:tc>
+        <w:tc>
+          <w:tcPr>
+            <w:tcW w:w="0" w:type="auto"/>
+            <w:vAlign w:val="center"/>
+            <w:hideMark/>
+          </w:tcPr>
+          <w:p>
+            <w:r>
+              <w:t>Interview personal trainers.</w:t>
+            </w:r>
+          </w:p>
+        </w:tc>
+      </w:tr>
+      <w:tr>
+        <w:trPr>
+          <w:tblCellSpacing w:w="15" w:type="dxa"/>
+        </w:trPr>
+        <w:tc>
+          <w:tcPr>
+            <w:tcW w:w="0" w:type="auto"/>
+            <w:vAlign w:val="center"/>
+            <w:hideMark/>
+          </w:tcPr>
+          <w:p>
+            <w:r>
+              <w:t>AS-06</w:t>
+            </w:r>
+          </w:p>
+        </w:tc>
+        <w:tc>
+          <w:tcPr>
+            <w:tcW w:w="0" w:type="auto"/>
+            <w:vAlign w:val="center"/>
+            <w:hideMark/>
+          </w:tcPr>
+          <w:p>
+            <w:r>
+              <w:t>Staff will manage daily operational information.</w:t>
+            </w:r>
+          </w:p>
+        </w:tc>
+        <w:tc>
+          <w:tcPr>
+            <w:tcW w:w="0" w:type="auto"/>
+            <w:vAlign w:val="center"/>
+            <w:hideMark/>
+          </w:tcPr>
+          <w:p>
+            <w:r>
+              <w:t>Observe the current staff workflow.</w:t>
+            </w:r>
+          </w:p>
+        </w:tc>
+      </w:tr>
+      <w:tr>
+        <w:trPr>
+          <w:tblCellSpacing w:w="15" w:type="dxa"/>
+        </w:trPr>
+        <w:tc>
+          <w:tcPr>
+            <w:tcW w:w="0" w:type="auto"/>
+            <w:vAlign w:val="center"/>
+            <w:hideMark/>
+          </w:tcPr>
+          <w:p>
+            <w:r>
+              <w:t>AS-07</w:t>
+            </w:r>
+          </w:p>
+        </w:tc>
+        <w:tc>
+          <w:tcPr>
+            <w:tcW w:w="0" w:type="auto"/>
+            <w:vAlign w:val="center"/>
+            <w:hideMark/>
+          </w:tcPr>
+          <w:p>
+            <w:r>
+              <w:t>The owner requires operational and management reports.</w:t>
+            </w:r>
+          </w:p>
+        </w:tc>
+        <w:tc>
+          <w:tcPr>
+            <w:tcW w:w="0" w:type="auto"/>
+            <w:vAlign w:val="center"/>
+            <w:hideMark/>
+          </w:tcPr>
+          <w:p>
+            <w:r>
+              <w:t>Interview the gym owner.</w:t>
+            </w:r>
+          </w:p>
+        </w:tc>
+      </w:tr>
+      <w:tr>
+        <w:trPr>
+          <w:tblCellSpacing w:w="15" w:type="dxa"/>
+        </w:trPr>
+        <w:tc>
+          <w:tcPr>
+            <w:tcW w:w="0" w:type="auto"/>
+            <w:vAlign w:val="center"/>
+            <w:hideMark/>
+          </w:tcPr>
+          <w:p>
+            <w:r>
+              <w:t>AS-08</w:t>
+            </w:r>
+          </w:p>
+        </w:tc>
+        <w:tc>
+          <w:tcPr>
+            <w:tcW w:w="0" w:type="auto"/>
+            <w:vAlign w:val="center"/>
+            <w:hideMark/>
+          </w:tcPr>
+          <w:p>
+            <w:r>
+              <w:t>MoMo QR payment is a desired integration.</w:t>
+            </w:r>
+          </w:p>
+        </w:tc>
+        <w:tc>
+          <w:tcPr>
+            <w:tcW w:w="0" w:type="auto"/>
+            <w:vAlign w:val="center"/>
+            <w:hideMark/>
+          </w:tcPr>
+          <w:p>
+            <w:r>
+              <w:t>Confirm payment requirements and merchant availability.</w:t>
+            </w:r>
+          </w:p>
+        </w:tc>
+      </w:tr>
+      <w:tr>
+        <w:trPr>
+          <w:tblCellSpacing w:w="15" w:type="dxa"/>
+        </w:trPr>
+        <w:tc>
+          <w:tcPr>
+            <w:tcW w:w="0" w:type="auto"/>
+            <w:vAlign w:val="center"/>
+            <w:hideMark/>
+          </w:tcPr>
+          <w:p>
+            <w:r>
+              <w:t>AS-09</w:t>
+            </w:r>
+          </w:p>
+        </w:tc>
+        <w:tc>
+          <w:tcPr>
+            <w:tcW w:w="0" w:type="auto"/>
+            <w:vAlign w:val="center"/>
+            <w:hideMark/>
+          </w:tcPr>
+          <w:p>
+            <w:r>
+              <w:t>Gmail notifications are required for reminders or system events.</w:t>
+            </w:r>
+          </w:p>
+        </w:tc>
+        <w:tc>
+          <w:tcPr>
+            <w:tcW w:w="0" w:type="auto"/>
+            <w:vAlign w:val="center"/>
+            <w:hideMark/>
+          </w:tcPr>
+          <w:p>
+            <w:r>
+              <w:t>Identify notification use cases.</w:t>
+            </w:r>
+          </w:p>
+        </w:tc>
+      </w:tr>
+      <w:tr>
+        <w:trPr>
+          <w:tblCellSpacing w:w="15" w:type="dxa"/>
+        </w:trPr>
+        <w:tc>
+          <w:tcPr>
+            <w:tcW w:w="0" w:type="auto"/>
+            <w:vAlign w:val="center"/>
+            <w:hideMark/>
+          </w:tcPr>
+          <w:p>
+            <w:r>
+              <w:t>AS-10</w:t>
+            </w:r>
+          </w:p>
+        </w:tc>
+        <w:tc>
+          <w:tcPr>
+            <w:tcW w:w="0" w:type="auto"/>
+            <w:vAlign w:val="center"/>
+            <w:hideMark/>
+          </w:tcPr>
+          <w:p>
+            <w:r>
+              <w:t>Mobile application development is not yet confirmed.</w:t>
+            </w:r>
+          </w:p>
+        </w:tc>
+        <w:tc>
+          <w:tcPr>
+            <w:tcW w:w="0" w:type="auto"/>
+            <w:vAlign w:val="center"/>
+            <w:hideMark/>
+          </w:tcPr>
+          <w:p>
+            <w:r>
+              <w:t>Confirm the final project scope.</w:t>
+            </w:r>
+          </w:p>
+        </w:tc>
+      </w:tr>
+    </w:tbl>
+    <w:p>
+      <w:r>
+        <w:pict w14:anchorId="34E27E95">
+          <v:rect id="_x0000_i1028" style="width:0;height:1.5pt" o:hralign="center" o:hrstd="t" o:hr="t" fillcolor="#a0a0a0" stroked="f"/>
+        </w:pict>
+      </w:r>
+    </w:p>
+    <w:p>
+      <w:pPr>
+        <w:pStyle w:val="Heading3"/>
+      </w:pPr>
+      <w:r>
+        <w:t>5. Unanswered Questions</w:t>
+      </w:r>
+    </w:p>
+    <w:p>
+      <w:pPr>
+        <w:pStyle w:val="Heading4"/>
+      </w:pPr>
+      <w:r>
+        <w:t>Business information</w:t>
+      </w:r>
+    </w:p>
+    <w:p>
+      <w:pPr>
+        <w:numPr>
+          <w:ilvl w:val="0"/>
+          <w:numId w:val="6"/>
+        </w:numPr>
+        <w:spacing w:before="100" w:beforeAutospacing="1" w:after="100" w:afterAutospacing="1" w:line="240" w:lineRule="auto"/>
+      </w:pPr>
+      <w:r>
+        <w:t xml:space="preserve">What type of gym is being operated? </w:t>
+      </w:r>
+    </w:p>
+    <w:p>
+      <w:pPr>
+        <w:numPr>
+          <w:ilvl w:val="0"/>
+          <w:numId w:val="6"/>
+        </w:numPr>
+        <w:spacing w:before="100" w:beforeAutospacing="1" w:after="100" w:afterAutospacing="1" w:line="240" w:lineRule="auto"/>
+      </w:pPr>
+      <w:r>
+        <w:t xml:space="preserve">How many branches does the gym currently have? </w:t>
+      </w:r>
+    </w:p>
+    <w:p>
+      <w:pPr>
+        <w:numPr>
+          <w:ilvl w:val="0"/>
+          <w:numId w:val="6"/>
+        </w:numPr>
+        <w:spacing w:before="100" w:beforeAutospacing="1" w:after="100" w:afterAutospacing="1" w:line="240" w:lineRule="auto"/>
+      </w:pPr>
+      <w:r>
+        <w:t xml:space="preserve">Are additional branches planned? </w:t>
+      </w:r>
+    </w:p>
+    <w:p>
+      <w:pPr>
+        <w:numPr>
+          <w:ilvl w:val="0"/>
+          <w:numId w:val="6"/>
+        </w:numPr>
+        <w:spacing w:before="100" w:beforeAutospacing="1" w:after="100" w:afterAutospacing="1" w:line="240" w:lineRule="auto"/>
+      </w:pPr>
+      <w:r>
+        <w:t xml:space="preserve">How many active customers does the gym serve? </w:t>
+      </w:r>
+    </w:p>
+    <w:p>
+      <w:pPr>
+        <w:numPr>
+          <w:ilvl w:val="0"/>
+          <w:numId w:val="6"/>
+        </w:numPr>
+        <w:spacing w:before="100" w:beforeAutospacing="1" w:after="100" w:afterAutospacing="1" w:line="240" w:lineRule="auto"/>
+      </w:pPr>
+      <w:r>
+        <w:t xml:space="preserve">How many staff members and personal trainers work at each branch? </w:t>
+      </w:r>
+    </w:p>
+    <w:p>
+      <w:pPr>
+        <w:numPr>
+          <w:ilvl w:val="0"/>
+          <w:numId w:val="6"/>
+        </w:numPr>
+        <w:spacing w:before="100" w:beforeAutospacing="1" w:after="100" w:afterAutospacing="1" w:line="240" w:lineRule="auto"/>
+      </w:pPr>
+      <w:r>
+        <w:t xml:space="preserve">What are the gym's opening hours? </w:t>
+      </w:r>
+    </w:p>
+    <w:p>
+      <w:pPr>
+        <w:numPr>
+          <w:ilvl w:val="0"/>
+          <w:numId w:val="6"/>
+        </w:numPr>
+        <w:spacing w:before="100" w:beforeAutospacing="1" w:after="100" w:afterAutospacing="1" w:line="240" w:lineRule="auto"/>
+      </w:pPr>
+      <w:r>
+        <w:t xml:space="preserve">What membership packages are currently offered? </w:t>
+      </w:r>
+    </w:p>
+    <w:p>
+      <w:pPr>
+        <w:pStyle w:val="Heading4"/>
+      </w:pPr>
+      <w:r>
+        <w:t>Current operation</w:t>
+      </w:r>
+    </w:p>
+    <w:p>
+      <w:pPr>
+        <w:numPr>
+          <w:ilvl w:val="0"/>
+          <w:numId w:val="7"/>
+        </w:numPr>
+        <w:spacing w:before="100" w:beforeAutospacing="1" w:after="100" w:afterAutospacing="1" w:line="240" w:lineRule="auto"/>
+      </w:pPr>
+      <w:r>
+        <w:t xml:space="preserve">How are customer records currently stored? </w:t>
+      </w:r>
+    </w:p>
+    <w:p>
+      <w:pPr>
+        <w:numPr>
+          <w:ilvl w:val="0"/>
+          <w:numId w:val="7"/>
+        </w:numPr>
+        <w:spacing w:before="100" w:beforeAutospacing="1" w:after="100" w:afterAutospacing="1" w:line="240" w:lineRule="auto"/>
+      </w:pPr>
+      <w:r>
+        <w:lastRenderedPageBreak/>
+        <w:t xml:space="preserve">How are memberships created, renewed, suspended, or cancelled? </w:t>
+      </w:r>
+    </w:p>
+    <w:p>
+      <w:pPr>
+        <w:numPr>
+          <w:ilvl w:val="0"/>
+          <w:numId w:val="7"/>
+        </w:numPr>
+        <w:spacing w:before="100" w:beforeAutospacing="1" w:after="100" w:afterAutospacing="1" w:line="240" w:lineRule="auto"/>
+      </w:pPr>
+      <w:r>
+        <w:t xml:space="preserve">How are personal trainers assigned to customers? </w:t>
+      </w:r>
+    </w:p>
+    <w:p>
+      <w:pPr>
+        <w:numPr>
+          <w:ilvl w:val="0"/>
+          <w:numId w:val="7"/>
+        </w:numPr>
+        <w:spacing w:before="100" w:beforeAutospacing="1" w:after="100" w:afterAutospacing="1" w:line="240" w:lineRule="auto"/>
+      </w:pPr>
+      <w:r>
+        <w:t xml:space="preserve">How are training schedules currently created and changed? </w:t>
+      </w:r>
+    </w:p>
+    <w:p>
+      <w:pPr>
+        <w:numPr>
+          <w:ilvl w:val="0"/>
+          <w:numId w:val="7"/>
+        </w:numPr>
+        <w:spacing w:before="100" w:beforeAutospacing="1" w:after="100" w:afterAutospacing="1" w:line="240" w:lineRule="auto"/>
+      </w:pPr>
+      <w:r>
+        <w:t xml:space="preserve">How is customer training progress currently recorded? </w:t>
+      </w:r>
+    </w:p>
+    <w:p>
+      <w:pPr>
+        <w:numPr>
+          <w:ilvl w:val="0"/>
+          <w:numId w:val="7"/>
+        </w:numPr>
+        <w:spacing w:before="100" w:beforeAutospacing="1" w:after="100" w:afterAutospacing="1" w:line="240" w:lineRule="auto"/>
+      </w:pPr>
+      <w:r>
+        <w:t xml:space="preserve">How is gym equipment monitored and maintained? </w:t>
+      </w:r>
+    </w:p>
+    <w:p>
+      <w:pPr>
+        <w:numPr>
+          <w:ilvl w:val="0"/>
+          <w:numId w:val="7"/>
+        </w:numPr>
+        <w:spacing w:before="100" w:beforeAutospacing="1" w:after="100" w:afterAutospacing="1" w:line="240" w:lineRule="auto"/>
+      </w:pPr>
+      <w:r>
+        <w:t xml:space="preserve">How are customer payments recorded? </w:t>
+      </w:r>
+    </w:p>
+    <w:p>
+      <w:pPr>
+        <w:numPr>
+          <w:ilvl w:val="0"/>
+          <w:numId w:val="7"/>
+        </w:numPr>
+        <w:spacing w:before="100" w:beforeAutospacing="1" w:after="100" w:afterAutospacing="1" w:line="240" w:lineRule="auto"/>
+      </w:pPr>
+      <w:r>
+        <w:t xml:space="preserve">Which spreadsheets, applications, or paper documents are currently used? </w:t>
+      </w:r>
+    </w:p>
+    <w:p>
+      <w:pPr>
+        <w:numPr>
+          <w:ilvl w:val="0"/>
+          <w:numId w:val="7"/>
+        </w:numPr>
+        <w:spacing w:before="100" w:beforeAutospacing="1" w:after="100" w:afterAutospacing="1" w:line="240" w:lineRule="auto"/>
+      </w:pPr>
+      <w:r>
+        <w:t xml:space="preserve">Which steps require duplicate data entry? </w:t>
+      </w:r>
+    </w:p>
+    <w:p>
+      <w:pPr>
+        <w:numPr>
+          <w:ilvl w:val="0"/>
+          <w:numId w:val="7"/>
+        </w:numPr>
+        <w:spacing w:before="100" w:beforeAutospacing="1" w:after="100" w:afterAutospacing="1" w:line="240" w:lineRule="auto"/>
+      </w:pPr>
+      <w:r>
+        <w:t xml:space="preserve">Which activities cause the most errors or delays? </w:t>
+      </w:r>
+    </w:p>
+    <w:p>
+      <w:pPr>
+        <w:pStyle w:val="Heading4"/>
+      </w:pPr>
+      <w:r>
+        <w:t>Current problems</w:t>
+      </w:r>
+    </w:p>
+    <w:p>
+      <w:pPr>
+        <w:numPr>
+          <w:ilvl w:val="0"/>
+          <w:numId w:val="8"/>
+        </w:numPr>
+        <w:spacing w:before="100" w:beforeAutospacing="1" w:after="100" w:afterAutospacing="1" w:line="240" w:lineRule="auto"/>
+      </w:pPr>
+      <w:r>
+        <w:t xml:space="preserve">What is the most serious problem in the current process? </w:t>
+      </w:r>
+    </w:p>
+    <w:p>
+      <w:pPr>
+        <w:numPr>
+          <w:ilvl w:val="0"/>
+          <w:numId w:val="8"/>
+        </w:numPr>
+        <w:spacing w:before="100" w:beforeAutospacing="1" w:after="100" w:afterAutospacing="1" w:line="240" w:lineRule="auto"/>
+      </w:pPr>
+      <w:r>
+        <w:t xml:space="preserve">How often do scheduling conflicts occur? </w:t>
+      </w:r>
+    </w:p>
+    <w:p>
+      <w:pPr>
+        <w:numPr>
+          <w:ilvl w:val="0"/>
+          <w:numId w:val="8"/>
+        </w:numPr>
+        <w:spacing w:before="100" w:beforeAutospacing="1" w:after="100" w:afterAutospacing="1" w:line="240" w:lineRule="auto"/>
+      </w:pPr>
+      <w:r>
+        <w:t xml:space="preserve">How often is customer or payment information incorrect or missing? </w:t>
+      </w:r>
+    </w:p>
+    <w:p>
+      <w:pPr>
+        <w:numPr>
+          <w:ilvl w:val="0"/>
+          <w:numId w:val="8"/>
+        </w:numPr>
+        <w:spacing w:before="100" w:beforeAutospacing="1" w:after="100" w:afterAutospacing="1" w:line="240" w:lineRule="auto"/>
+      </w:pPr>
+      <w:r>
+        <w:t xml:space="preserve">Which tasks consume the most staff time? </w:t>
+      </w:r>
+    </w:p>
+    <w:p>
+      <w:pPr>
+        <w:numPr>
+          <w:ilvl w:val="0"/>
+          <w:numId w:val="8"/>
+        </w:numPr>
+        <w:spacing w:before="100" w:beforeAutospacing="1" w:after="100" w:afterAutospacing="1" w:line="240" w:lineRule="auto"/>
+      </w:pPr>
+      <w:r>
+        <w:t xml:space="preserve">What complaints are commonly received from customers? </w:t>
+      </w:r>
+    </w:p>
+    <w:p>
+      <w:pPr>
+        <w:numPr>
+          <w:ilvl w:val="0"/>
+          <w:numId w:val="8"/>
+        </w:numPr>
+        <w:spacing w:before="100" w:beforeAutospacing="1" w:after="100" w:afterAutospacing="1" w:line="240" w:lineRule="auto"/>
+      </w:pPr>
+      <w:r>
+        <w:t xml:space="preserve">What difficulties do personal trainers experience? </w:t>
+      </w:r>
+    </w:p>
+    <w:p>
+      <w:pPr>
+        <w:numPr>
+          <w:ilvl w:val="0"/>
+          <w:numId w:val="8"/>
+        </w:numPr>
+        <w:spacing w:before="100" w:beforeAutospacing="1" w:after="100" w:afterAutospacing="1" w:line="240" w:lineRule="auto"/>
+      </w:pPr>
+      <w:r>
+        <w:t xml:space="preserve">What information does the owner currently lack? </w:t>
+      </w:r>
+    </w:p>
+    <w:p>
+      <w:pPr>
+        <w:pStyle w:val="Heading4"/>
+      </w:pPr>
+      <w:r>
+        <w:t>Expected results</w:t>
+      </w:r>
+    </w:p>
+    <w:p>
+      <w:pPr>
+        <w:numPr>
+          <w:ilvl w:val="0"/>
+          <w:numId w:val="9"/>
+        </w:numPr>
+        <w:spacing w:before="100" w:beforeAutospacing="1" w:after="100" w:afterAutospacing="1" w:line="240" w:lineRule="auto"/>
+      </w:pPr>
+      <w:r>
+        <w:t xml:space="preserve">What business results should improve after implementation? </w:t>
+      </w:r>
+    </w:p>
+    <w:p>
+      <w:pPr>
+        <w:numPr>
+          <w:ilvl w:val="0"/>
+          <w:numId w:val="9"/>
+        </w:numPr>
+        <w:spacing w:before="100" w:beforeAutospacing="1" w:after="100" w:afterAutospacing="1" w:line="240" w:lineRule="auto"/>
+      </w:pPr>
+      <w:r>
+        <w:t xml:space="preserve">Which processes should become faster? </w:t>
+      </w:r>
+    </w:p>
+    <w:p>
+      <w:pPr>
+        <w:numPr>
+          <w:ilvl w:val="0"/>
+          <w:numId w:val="9"/>
+        </w:numPr>
+        <w:spacing w:before="100" w:beforeAutospacing="1" w:after="100" w:afterAutospacing="1" w:line="240" w:lineRule="auto"/>
+      </w:pPr>
+      <w:r>
+        <w:t xml:space="preserve">Which errors should be reduced? </w:t>
+      </w:r>
+    </w:p>
+    <w:p>
+      <w:pPr>
+        <w:numPr>
+          <w:ilvl w:val="0"/>
+          <w:numId w:val="9"/>
+        </w:numPr>
+        <w:spacing w:before="100" w:beforeAutospacing="1" w:after="100" w:afterAutospacing="1" w:line="240" w:lineRule="auto"/>
+      </w:pPr>
+      <w:r>
+        <w:t xml:space="preserve">Which reports does the owner require? </w:t>
+      </w:r>
+    </w:p>
+    <w:p>
+      <w:pPr>
+        <w:numPr>
+          <w:ilvl w:val="0"/>
+          <w:numId w:val="9"/>
+        </w:numPr>
+        <w:spacing w:before="100" w:beforeAutospacing="1" w:after="100" w:afterAutospacing="1" w:line="240" w:lineRule="auto"/>
+      </w:pPr>
+      <w:r>
+        <w:t xml:space="preserve">How will the customer determine whether the project is successful? </w:t>
+      </w:r>
+    </w:p>
+    <w:p>
+      <w:pPr>
+        <w:numPr>
+          <w:ilvl w:val="0"/>
+          <w:numId w:val="9"/>
+        </w:numPr>
+        <w:spacing w:before="100" w:beforeAutospacing="1" w:after="100" w:afterAutospacing="1" w:line="240" w:lineRule="auto"/>
+      </w:pPr>
+      <w:r>
+        <w:t xml:space="preserve">What measurable success indicators should be used? </w:t>
+      </w:r>
+    </w:p>
+    <w:p>
+      <w:pPr>
+        <w:pStyle w:val="Heading4"/>
+      </w:pPr>
+      <w:r>
+        <w:t>Constraints</w:t>
+      </w:r>
+    </w:p>
+    <w:p>
+      <w:pPr>
+        <w:numPr>
+          <w:ilvl w:val="0"/>
+          <w:numId w:val="10"/>
+        </w:numPr>
+        <w:spacing w:before="100" w:beforeAutospacing="1" w:after="100" w:afterAutospacing="1" w:line="240" w:lineRule="auto"/>
+      </w:pPr>
+      <w:r>
+        <w:t xml:space="preserve">What is the expected project deadline? </w:t>
+      </w:r>
+    </w:p>
+    <w:p>
+      <w:pPr>
+        <w:numPr>
+          <w:ilvl w:val="0"/>
+          <w:numId w:val="10"/>
+        </w:numPr>
+        <w:spacing w:before="100" w:beforeAutospacing="1" w:after="100" w:afterAutospacing="1" w:line="240" w:lineRule="auto"/>
+      </w:pPr>
+      <w:r>
+        <w:t xml:space="preserve">What is the available budget? </w:t>
+      </w:r>
+    </w:p>
+    <w:p>
+      <w:pPr>
+        <w:numPr>
+          <w:ilvl w:val="0"/>
+          <w:numId w:val="10"/>
+        </w:numPr>
+        <w:spacing w:before="100" w:beforeAutospacing="1" w:after="100" w:afterAutospacing="1" w:line="240" w:lineRule="auto"/>
+      </w:pPr>
+      <w:r>
+        <w:t xml:space="preserve">Is a mobile application included in the first release? </w:t>
+      </w:r>
+    </w:p>
+    <w:p>
+      <w:pPr>
+        <w:numPr>
+          <w:ilvl w:val="0"/>
+          <w:numId w:val="10"/>
+        </w:numPr>
+        <w:spacing w:before="100" w:beforeAutospacing="1" w:after="100" w:afterAutospacing="1" w:line="240" w:lineRule="auto"/>
+      </w:pPr>
+      <w:r>
+        <w:t xml:space="preserve">Is MoMo the only required payment provider? </w:t>
+      </w:r>
+    </w:p>
+    <w:p>
+      <w:pPr>
+        <w:numPr>
+          <w:ilvl w:val="0"/>
+          <w:numId w:val="10"/>
+        </w:numPr>
+        <w:spacing w:before="100" w:beforeAutospacing="1" w:after="100" w:afterAutospacing="1" w:line="240" w:lineRule="auto"/>
+      </w:pPr>
+      <w:r>
+        <w:t xml:space="preserve">Which Gmail notifications are required? </w:t>
+      </w:r>
+    </w:p>
+    <w:p>
+      <w:pPr>
+        <w:numPr>
+          <w:ilvl w:val="0"/>
+          <w:numId w:val="10"/>
+        </w:numPr>
+        <w:spacing w:before="100" w:beforeAutospacing="1" w:after="100" w:afterAutospacing="1" w:line="240" w:lineRule="auto"/>
+      </w:pPr>
+      <w:r>
+        <w:t xml:space="preserve">Are there existing systems or data that must be migrated? </w:t>
+      </w:r>
+    </w:p>
+    <w:p>
+      <w:pPr>
+        <w:numPr>
+          <w:ilvl w:val="0"/>
+          <w:numId w:val="10"/>
+        </w:numPr>
+        <w:spacing w:before="100" w:beforeAutospacing="1" w:after="100" w:afterAutospacing="1" w:line="240" w:lineRule="auto"/>
+      </w:pPr>
+      <w:r>
+        <w:t xml:space="preserve">Are there privacy or access-control requirements? </w:t>
+      </w:r>
+    </w:p>
+    <w:p>
+      <w:pPr>
+        <w:numPr>
+          <w:ilvl w:val="0"/>
+          <w:numId w:val="10"/>
+        </w:numPr>
+        <w:spacing w:before="100" w:beforeAutospacing="1" w:after="100" w:afterAutospacing="1" w:line="240" w:lineRule="auto"/>
+      </w:pPr>
+      <w:r>
+        <w:t>Who has authority to approve the requirements?</w:t>
       </w:r>
     </w:p>
     <w:p/>
@@ -230,8 +1415,496 @@
 </file>
 
 <file path=word/numbering.xml><?xml version="1.0" encoding="utf-8"?>
-<w:numbering xmlns:wpc="http://schemas.microsoft.com/office/word/2010/wordprocessingCanvas" xmlns:cx="http://schemas.microsoft.com/office/drawing/2014/chartex" xmlns:cx1="http://schemas.microsoft.com/office/drawing/2015/9/8/chartex" xmlns:cx2="http://schemas.microsoft.com/office/drawing/2015/10/21/chartex" xmlns:cx3="http://schemas.microsoft.com/office/drawing/2016/5/9/chartex" xmlns:cx4="http://schemas.microsoft.com/office/drawing/2016/5/10/chartex" xmlns:cx5="http://schemas.microsoft.com/office/drawing/2016/5/11/chartex" xmlns:cx6="http://schemas.microsoft.com/office/drawing/2016/5/12/chartex" xmlns:cx7="http://schemas.microsoft.com/office/drawing/2016/5/13/chartex" xmlns:cx8="http://schemas.microsoft.com/office/drawing/2016/5/14/chartex" xmlns:mc="http://schemas.openxmlformats.org/markup-compatibility/2006" xmlns:aink="http://schemas.microsoft.com/office/drawing/2016/ink" xmlns:am3d="http://schemas.microsoft.com/office/drawing/2017/model3d" xmlns:o="urn:schemas-microsoft-com:office:office" xmlns:oel="http://schemas.microsoft.com/office/2019/extlst" xmlns:r="http://schemas.openxmlformats.org/officeDocument/2006/relationships" xmlns:m="http://schemas.openxmlformats.org/officeDocument/2006/math" xmlns:v="urn:schemas-microsoft-com:vml" xmlns:wp14="http://schemas.microsoft.com/office/word/2010/wordprocessingDrawing" xmlns:wp="http://schemas.openxmlformats.org/drawingml/2006/wordprocessingDrawing" xmlns:w10="urn:schemas-microsoft-com:office:word" xmlns:w="http://schemas.openxmlformats.org/wordprocessingml/2006/main" xmlns:w14="http://schemas.microsoft.com/office/word/2010/wordml" xmlns:w15="http://schemas.microsoft.com/office/word/2012/wordml" xmlns:w16cei="http://schemas.microsoft.com/office/word/2026/wordml/cei" xmlns:w16cex="http://schemas.microsoft.com/office/word/2018/wordml/cex" xmlns:w16cid="http://schemas.microsoft.com/office/word/2016/wordml/cid" xmlns:w16="http://schemas.microsoft.com/office/word/2018/wordml" xmlns:w16du="http://schemas.microsoft.com/office/word/2023/wordml/word16du" xmlns:w16sdtdh="http://schemas.microsoft.com/office/word/2020/wordml/sdtdatahash" xmlns:w16sdtfl="http://schemas.microsoft.com/office/word/2024/wordml/sdtformatlock" xmlns:w16se="http://schemas.microsoft.com/office/word/2015/wordml/symex" xmlns:wpg="http://schemas.microsoft.com/office/word/2010/wordprocessingGroup" xmlns:wpi="http://schemas.microsoft.com/office/word/2010/wordprocessingInk" xmlns:wne="http://schemas.microsoft.com/office/word/2006/wordml" xmlns:wps="http://schemas.microsoft.com/office/word/2010/wordprocessingShape" mc:Ignorable="w14 w15 w16se w16cid w16 w16cex w16sdtdh w16sdtfl w16du wp14">
+<w:numbering xmlns:wpc="http://schemas.microsoft.com/office/word/2010/wordprocessingCanvas" xmlns:cx="http://schemas.microsoft.com/office/drawing/2014/chartex" xmlns:cx1="http://schemas.microsoft.com/office/drawing/2015/9/8/chartex" xmlns:cx2="http://schemas.microsoft.com/office/drawing/2015/10/21/chartex" xmlns:cx3="http://schemas.microsoft.com/office/drawing/2016/5/9/chartex" xmlns:cx4="http://schemas.microsoft.com/office/drawing/2016/5/10/chartex" xmlns:cx5="http://schemas.microsoft.com/office/drawing/2016/5/11/chartex" xmlns:cx6="http://schemas.microsoft.com/office/drawing/2016/5/12/chartex" xmlns:cx7="http://schemas.microsoft.com/office/drawing/2016/5/13/chartex" xmlns:cx8="http://schemas.microsoft.com/office/drawing/2016/5/14/chartex" xmlns:mc="http://schemas.openxmlformats.org/markup-compatibility/2006" xmlns:aink="http://schemas.microsoft.com/office/drawing/2016/ink" xmlns:am3d="http://schemas.microsoft.com/office/drawing/2017/model3d" xmlns:o="urn:schemas-microsoft-com:office:office" xmlns:oel="http://schemas.microsoft.com/office/2019/extlst" xmlns:r="http://schemas.openxmlformats.org/officeDocument/2006/relationships" xmlns:m="http://schemas.openxmlformats.org/officeDocument/2006/math" xmlns:v="urn:schemas-microsoft-com:vml" xmlns:wp14="http://schemas.microsoft.com/office/word/2010/wordprocessingDrawing" xmlns:wp="http://schemas.openxmlformats.org/drawingml/2006/wordprocessingDrawing" xmlns:w10="urn:schemas-microsoft-com:office:word" xmlns:w="http://schemas.openxmlformats.org/wordprocessingml/2006/main" xmlns:w14="http://schemas.microsoft.com/office/word/2010/wordml" xmlns:w15="http://schemas.microsoft.com/office/word/2012/wordml" xmlns:w16cex="http://schemas.microsoft.com/office/word/2018/wordml/cex" xmlns:w16cid="http://schemas.microsoft.com/office/word/2016/wordml/cid" xmlns:w16="http://schemas.microsoft.com/office/word/2018/wordml" xmlns:w16du="http://schemas.microsoft.com/office/word/2023/wordml/word16du" xmlns:w16sdtdh="http://schemas.microsoft.com/office/word/2020/wordml/sdtdatahash" xmlns:w16sdtfl="http://schemas.microsoft.com/office/word/2024/wordml/sdtformatlock" xmlns:w16se="http://schemas.microsoft.com/office/word/2015/wordml/symex" xmlns:wpg="http://schemas.microsoft.com/office/word/2010/wordprocessingGroup" xmlns:wpi="http://schemas.microsoft.com/office/word/2010/wordprocessingInk" xmlns:wne="http://schemas.microsoft.com/office/word/2006/wordml" xmlns:wps="http://schemas.microsoft.com/office/word/2010/wordprocessingShape" mc:Ignorable="w14 w15 w16se w16cid w16 w16cex w16sdtdh w16sdtfl w16du wp14">
   <w:abstractNum w:abstractNumId="0" w15:restartNumberingAfterBreak="0">
+    <w:nsid w:val="0F335B54"/>
+    <w:multiLevelType w:val="multilevel"/>
+    <w:tmpl w:val="FF4811E0"/>
+    <w:lvl w:ilvl="0">
+      <w:start w:val="1"/>
+      <w:numFmt w:val="bullet"/>
+      <w:lvlText w:val=""/>
+      <w:lvlJc w:val="left"/>
+      <w:pPr>
+        <w:tabs>
+          <w:tab w:val="num" w:pos="720"/>
+        </w:tabs>
+        <w:ind w:left="720" w:hanging="360"/>
+      </w:pPr>
+      <w:rPr>
+        <w:rFonts w:ascii="Symbol" w:hAnsi="Symbol" w:hint="default"/>
+        <w:sz w:val="20"/>
+      </w:rPr>
+    </w:lvl>
+    <w:lvl w:ilvl="1" w:tentative="1">
+      <w:start w:val="1"/>
+      <w:numFmt w:val="bullet"/>
+      <w:lvlText w:val="o"/>
+      <w:lvlJc w:val="left"/>
+      <w:pPr>
+        <w:tabs>
+          <w:tab w:val="num" w:pos="1440"/>
+        </w:tabs>
+        <w:ind w:left="1440" w:hanging="360"/>
+      </w:pPr>
+      <w:rPr>
+        <w:rFonts w:ascii="Courier New" w:hAnsi="Courier New" w:hint="default"/>
+        <w:sz w:val="20"/>
+      </w:rPr>
+    </w:lvl>
+    <w:lvl w:ilvl="2" w:tentative="1">
+      <w:start w:val="1"/>
+      <w:numFmt w:val="bullet"/>
+      <w:lvlText w:val=""/>
+      <w:lvlJc w:val="left"/>
+      <w:pPr>
+        <w:tabs>
+          <w:tab w:val="num" w:pos="2160"/>
+        </w:tabs>
+        <w:ind w:left="2160" w:hanging="360"/>
+      </w:pPr>
+      <w:rPr>
+        <w:rFonts w:ascii="Wingdings" w:hAnsi="Wingdings" w:hint="default"/>
+        <w:sz w:val="20"/>
+      </w:rPr>
+    </w:lvl>
+    <w:lvl w:ilvl="3" w:tentative="1">
+      <w:start w:val="1"/>
+      <w:numFmt w:val="bullet"/>
+      <w:lvlText w:val=""/>
+      <w:lvlJc w:val="left"/>
+      <w:pPr>
+        <w:tabs>
+          <w:tab w:val="num" w:pos="2880"/>
+        </w:tabs>
+        <w:ind w:left="2880" w:hanging="360"/>
+      </w:pPr>
+      <w:rPr>
+        <w:rFonts w:ascii="Wingdings" w:hAnsi="Wingdings" w:hint="default"/>
+        <w:sz w:val="20"/>
+      </w:rPr>
+    </w:lvl>
+    <w:lvl w:ilvl="4" w:tentative="1">
+      <w:start w:val="1"/>
+      <w:numFmt w:val="bullet"/>
+      <w:lvlText w:val=""/>
+      <w:lvlJc w:val="left"/>
+      <w:pPr>
+        <w:tabs>
+          <w:tab w:val="num" w:pos="3600"/>
+        </w:tabs>
+        <w:ind w:left="3600" w:hanging="360"/>
+      </w:pPr>
+      <w:rPr>
+        <w:rFonts w:ascii="Wingdings" w:hAnsi="Wingdings" w:hint="default"/>
+        <w:sz w:val="20"/>
+      </w:rPr>
+    </w:lvl>
+    <w:lvl w:ilvl="5" w:tentative="1">
+      <w:start w:val="1"/>
+      <w:numFmt w:val="bullet"/>
+      <w:lvlText w:val=""/>
+      <w:lvlJc w:val="left"/>
+      <w:pPr>
+        <w:tabs>
+          <w:tab w:val="num" w:pos="4320"/>
+        </w:tabs>
+        <w:ind w:left="4320" w:hanging="360"/>
+      </w:pPr>
+      <w:rPr>
+        <w:rFonts w:ascii="Wingdings" w:hAnsi="Wingdings" w:hint="default"/>
+        <w:sz w:val="20"/>
+      </w:rPr>
+    </w:lvl>
+    <w:lvl w:ilvl="6" w:tentative="1">
+      <w:start w:val="1"/>
+      <w:numFmt w:val="bullet"/>
+      <w:lvlText w:val=""/>
+      <w:lvlJc w:val="left"/>
+      <w:pPr>
+        <w:tabs>
+          <w:tab w:val="num" w:pos="5040"/>
+        </w:tabs>
+        <w:ind w:left="5040" w:hanging="360"/>
+      </w:pPr>
+      <w:rPr>
+        <w:rFonts w:ascii="Wingdings" w:hAnsi="Wingdings" w:hint="default"/>
+        <w:sz w:val="20"/>
+      </w:rPr>
+    </w:lvl>
+    <w:lvl w:ilvl="7" w:tentative="1">
+      <w:start w:val="1"/>
+      <w:numFmt w:val="bullet"/>
+      <w:lvlText w:val=""/>
+      <w:lvlJc w:val="left"/>
+      <w:pPr>
+        <w:tabs>
+          <w:tab w:val="num" w:pos="5760"/>
+        </w:tabs>
+        <w:ind w:left="5760" w:hanging="360"/>
+      </w:pPr>
+      <w:rPr>
+        <w:rFonts w:ascii="Wingdings" w:hAnsi="Wingdings" w:hint="default"/>
+        <w:sz w:val="20"/>
+      </w:rPr>
+    </w:lvl>
+    <w:lvl w:ilvl="8" w:tentative="1">
+      <w:start w:val="1"/>
+      <w:numFmt w:val="bullet"/>
+      <w:lvlText w:val=""/>
+      <w:lvlJc w:val="left"/>
+      <w:pPr>
+        <w:tabs>
+          <w:tab w:val="num" w:pos="6480"/>
+        </w:tabs>
+        <w:ind w:left="6480" w:hanging="360"/>
+      </w:pPr>
+      <w:rPr>
+        <w:rFonts w:ascii="Wingdings" w:hAnsi="Wingdings" w:hint="default"/>
+        <w:sz w:val="20"/>
+      </w:rPr>
+    </w:lvl>
+  </w:abstractNum>
+  <w:abstractNum w:abstractNumId="1" w15:restartNumberingAfterBreak="0">
+    <w:nsid w:val="15FA4AE4"/>
+    <w:multiLevelType w:val="multilevel"/>
+    <w:tmpl w:val="8C96F418"/>
+    <w:lvl w:ilvl="0">
+      <w:start w:val="8"/>
+      <w:numFmt w:val="decimal"/>
+      <w:lvlText w:val="%1."/>
+      <w:lvlJc w:val="left"/>
+      <w:pPr>
+        <w:tabs>
+          <w:tab w:val="num" w:pos="720"/>
+        </w:tabs>
+        <w:ind w:left="720" w:hanging="360"/>
+      </w:pPr>
+    </w:lvl>
+    <w:lvl w:ilvl="1" w:tentative="1">
+      <w:start w:val="1"/>
+      <w:numFmt w:val="decimal"/>
+      <w:lvlText w:val="%2."/>
+      <w:lvlJc w:val="left"/>
+      <w:pPr>
+        <w:tabs>
+          <w:tab w:val="num" w:pos="1440"/>
+        </w:tabs>
+        <w:ind w:left="1440" w:hanging="360"/>
+      </w:pPr>
+    </w:lvl>
+    <w:lvl w:ilvl="2" w:tentative="1">
+      <w:start w:val="1"/>
+      <w:numFmt w:val="decimal"/>
+      <w:lvlText w:val="%3."/>
+      <w:lvlJc w:val="left"/>
+      <w:pPr>
+        <w:tabs>
+          <w:tab w:val="num" w:pos="2160"/>
+        </w:tabs>
+        <w:ind w:left="2160" w:hanging="360"/>
+      </w:pPr>
+    </w:lvl>
+    <w:lvl w:ilvl="3" w:tentative="1">
+      <w:start w:val="1"/>
+      <w:numFmt w:val="decimal"/>
+      <w:lvlText w:val="%4."/>
+      <w:lvlJc w:val="left"/>
+      <w:pPr>
+        <w:tabs>
+          <w:tab w:val="num" w:pos="2880"/>
+        </w:tabs>
+        <w:ind w:left="2880" w:hanging="360"/>
+      </w:pPr>
+    </w:lvl>
+    <w:lvl w:ilvl="4" w:tentative="1">
+      <w:start w:val="1"/>
+      <w:numFmt w:val="decimal"/>
+      <w:lvlText w:val="%5."/>
+      <w:lvlJc w:val="left"/>
+      <w:pPr>
+        <w:tabs>
+          <w:tab w:val="num" w:pos="3600"/>
+        </w:tabs>
+        <w:ind w:left="3600" w:hanging="360"/>
+      </w:pPr>
+    </w:lvl>
+    <w:lvl w:ilvl="5" w:tentative="1">
+      <w:start w:val="1"/>
+      <w:numFmt w:val="decimal"/>
+      <w:lvlText w:val="%6."/>
+      <w:lvlJc w:val="left"/>
+      <w:pPr>
+        <w:tabs>
+          <w:tab w:val="num" w:pos="4320"/>
+        </w:tabs>
+        <w:ind w:left="4320" w:hanging="360"/>
+      </w:pPr>
+    </w:lvl>
+    <w:lvl w:ilvl="6" w:tentative="1">
+      <w:start w:val="1"/>
+      <w:numFmt w:val="decimal"/>
+      <w:lvlText w:val="%7."/>
+      <w:lvlJc w:val="left"/>
+      <w:pPr>
+        <w:tabs>
+          <w:tab w:val="num" w:pos="5040"/>
+        </w:tabs>
+        <w:ind w:left="5040" w:hanging="360"/>
+      </w:pPr>
+    </w:lvl>
+    <w:lvl w:ilvl="7" w:tentative="1">
+      <w:start w:val="1"/>
+      <w:numFmt w:val="decimal"/>
+      <w:lvlText w:val="%8."/>
+      <w:lvlJc w:val="left"/>
+      <w:pPr>
+        <w:tabs>
+          <w:tab w:val="num" w:pos="5760"/>
+        </w:tabs>
+        <w:ind w:left="5760" w:hanging="360"/>
+      </w:pPr>
+    </w:lvl>
+    <w:lvl w:ilvl="8" w:tentative="1">
+      <w:start w:val="1"/>
+      <w:numFmt w:val="decimal"/>
+      <w:lvlText w:val="%9."/>
+      <w:lvlJc w:val="left"/>
+      <w:pPr>
+        <w:tabs>
+          <w:tab w:val="num" w:pos="6480"/>
+        </w:tabs>
+        <w:ind w:left="6480" w:hanging="360"/>
+      </w:pPr>
+    </w:lvl>
+  </w:abstractNum>
+  <w:abstractNum w:abstractNumId="2" w15:restartNumberingAfterBreak="0">
+    <w:nsid w:val="16987DDC"/>
+    <w:multiLevelType w:val="multilevel"/>
+    <w:tmpl w:val="78CCA726"/>
+    <w:lvl w:ilvl="0">
+      <w:start w:val="18"/>
+      <w:numFmt w:val="decimal"/>
+      <w:lvlText w:val="%1."/>
+      <w:lvlJc w:val="left"/>
+      <w:pPr>
+        <w:tabs>
+          <w:tab w:val="num" w:pos="720"/>
+        </w:tabs>
+        <w:ind w:left="720" w:hanging="360"/>
+      </w:pPr>
+    </w:lvl>
+    <w:lvl w:ilvl="1" w:tentative="1">
+      <w:start w:val="1"/>
+      <w:numFmt w:val="decimal"/>
+      <w:lvlText w:val="%2."/>
+      <w:lvlJc w:val="left"/>
+      <w:pPr>
+        <w:tabs>
+          <w:tab w:val="num" w:pos="1440"/>
+        </w:tabs>
+        <w:ind w:left="1440" w:hanging="360"/>
+      </w:pPr>
+    </w:lvl>
+    <w:lvl w:ilvl="2" w:tentative="1">
+      <w:start w:val="1"/>
+      <w:numFmt w:val="decimal"/>
+      <w:lvlText w:val="%3."/>
+      <w:lvlJc w:val="left"/>
+      <w:pPr>
+        <w:tabs>
+          <w:tab w:val="num" w:pos="2160"/>
+        </w:tabs>
+        <w:ind w:left="2160" w:hanging="360"/>
+      </w:pPr>
+    </w:lvl>
+    <w:lvl w:ilvl="3" w:tentative="1">
+      <w:start w:val="1"/>
+      <w:numFmt w:val="decimal"/>
+      <w:lvlText w:val="%4."/>
+      <w:lvlJc w:val="left"/>
+      <w:pPr>
+        <w:tabs>
+          <w:tab w:val="num" w:pos="2880"/>
+        </w:tabs>
+        <w:ind w:left="2880" w:hanging="360"/>
+      </w:pPr>
+    </w:lvl>
+    <w:lvl w:ilvl="4" w:tentative="1">
+      <w:start w:val="1"/>
+      <w:numFmt w:val="decimal"/>
+      <w:lvlText w:val="%5."/>
+      <w:lvlJc w:val="left"/>
+      <w:pPr>
+        <w:tabs>
+          <w:tab w:val="num" w:pos="3600"/>
+        </w:tabs>
+        <w:ind w:left="3600" w:hanging="360"/>
+      </w:pPr>
+    </w:lvl>
+    <w:lvl w:ilvl="5" w:tentative="1">
+      <w:start w:val="1"/>
+      <w:numFmt w:val="decimal"/>
+      <w:lvlText w:val="%6."/>
+      <w:lvlJc w:val="left"/>
+      <w:pPr>
+        <w:tabs>
+          <w:tab w:val="num" w:pos="4320"/>
+        </w:tabs>
+        <w:ind w:left="4320" w:hanging="360"/>
+      </w:pPr>
+    </w:lvl>
+    <w:lvl w:ilvl="6" w:tentative="1">
+      <w:start w:val="1"/>
+      <w:numFmt w:val="decimal"/>
+      <w:lvlText w:val="%7."/>
+      <w:lvlJc w:val="left"/>
+      <w:pPr>
+        <w:tabs>
+          <w:tab w:val="num" w:pos="5040"/>
+        </w:tabs>
+        <w:ind w:left="5040" w:hanging="360"/>
+      </w:pPr>
+    </w:lvl>
+    <w:lvl w:ilvl="7" w:tentative="1">
+      <w:start w:val="1"/>
+      <w:numFmt w:val="decimal"/>
+      <w:lvlText w:val="%8."/>
+      <w:lvlJc w:val="left"/>
+      <w:pPr>
+        <w:tabs>
+          <w:tab w:val="num" w:pos="5760"/>
+        </w:tabs>
+        <w:ind w:left="5760" w:hanging="360"/>
+      </w:pPr>
+    </w:lvl>
+    <w:lvl w:ilvl="8" w:tentative="1">
+      <w:start w:val="1"/>
+      <w:numFmt w:val="decimal"/>
+      <w:lvlText w:val="%9."/>
+      <w:lvlJc w:val="left"/>
+      <w:pPr>
+        <w:tabs>
+          <w:tab w:val="num" w:pos="6480"/>
+        </w:tabs>
+        <w:ind w:left="6480" w:hanging="360"/>
+      </w:pPr>
+    </w:lvl>
+  </w:abstractNum>
+  <w:abstractNum w:abstractNumId="3" w15:restartNumberingAfterBreak="0">
+    <w:nsid w:val="39663F2E"/>
+    <w:multiLevelType w:val="multilevel"/>
+    <w:tmpl w:val="04E62468"/>
+    <w:lvl w:ilvl="0">
+      <w:start w:val="25"/>
+      <w:numFmt w:val="decimal"/>
+      <w:lvlText w:val="%1."/>
+      <w:lvlJc w:val="left"/>
+      <w:pPr>
+        <w:tabs>
+          <w:tab w:val="num" w:pos="720"/>
+        </w:tabs>
+        <w:ind w:left="720" w:hanging="360"/>
+      </w:pPr>
+    </w:lvl>
+    <w:lvl w:ilvl="1" w:tentative="1">
+      <w:start w:val="1"/>
+      <w:numFmt w:val="decimal"/>
+      <w:lvlText w:val="%2."/>
+      <w:lvlJc w:val="left"/>
+      <w:pPr>
+        <w:tabs>
+          <w:tab w:val="num" w:pos="1440"/>
+        </w:tabs>
+        <w:ind w:left="1440" w:hanging="360"/>
+      </w:pPr>
+    </w:lvl>
+    <w:lvl w:ilvl="2" w:tentative="1">
+      <w:start w:val="1"/>
+      <w:numFmt w:val="decimal"/>
+      <w:lvlText w:val="%3."/>
+      <w:lvlJc w:val="left"/>
+      <w:pPr>
+        <w:tabs>
+          <w:tab w:val="num" w:pos="2160"/>
+        </w:tabs>
+        <w:ind w:left="2160" w:hanging="360"/>
+      </w:pPr>
+    </w:lvl>
+    <w:lvl w:ilvl="3" w:tentative="1">
+      <w:start w:val="1"/>
+      <w:numFmt w:val="decimal"/>
+      <w:lvlText w:val="%4."/>
+      <w:lvlJc w:val="left"/>
+      <w:pPr>
+        <w:tabs>
+          <w:tab w:val="num" w:pos="2880"/>
+        </w:tabs>
+        <w:ind w:left="2880" w:hanging="360"/>
+      </w:pPr>
+    </w:lvl>
+    <w:lvl w:ilvl="4" w:tentative="1">
+      <w:start w:val="1"/>
+      <w:numFmt w:val="decimal"/>
+      <w:lvlText w:val="%5."/>
+      <w:lvlJc w:val="left"/>
+      <w:pPr>
+        <w:tabs>
+          <w:tab w:val="num" w:pos="3600"/>
+        </w:tabs>
+        <w:ind w:left="3600" w:hanging="360"/>
+      </w:pPr>
+    </w:lvl>
+    <w:lvl w:ilvl="5" w:tentative="1">
+      <w:start w:val="1"/>
+      <w:numFmt w:val="decimal"/>
+      <w:lvlText w:val="%6."/>
+      <w:lvlJc w:val="left"/>
+      <w:pPr>
+        <w:tabs>
+          <w:tab w:val="num" w:pos="4320"/>
+        </w:tabs>
+        <w:ind w:left="4320" w:hanging="360"/>
+      </w:pPr>
+    </w:lvl>
+    <w:lvl w:ilvl="6" w:tentative="1">
+      <w:start w:val="1"/>
+      <w:numFmt w:val="decimal"/>
+      <w:lvlText w:val="%7."/>
+      <w:lvlJc w:val="left"/>
+      <w:pPr>
+        <w:tabs>
+          <w:tab w:val="num" w:pos="5040"/>
+        </w:tabs>
+        <w:ind w:left="5040" w:hanging="360"/>
+      </w:pPr>
+    </w:lvl>
+    <w:lvl w:ilvl="7" w:tentative="1">
+      <w:start w:val="1"/>
+      <w:numFmt w:val="decimal"/>
+      <w:lvlText w:val="%8."/>
+      <w:lvlJc w:val="left"/>
+      <w:pPr>
+        <w:tabs>
+          <w:tab w:val="num" w:pos="5760"/>
+        </w:tabs>
+        <w:ind w:left="5760" w:hanging="360"/>
+      </w:pPr>
+    </w:lvl>
+    <w:lvl w:ilvl="8" w:tentative="1">
+      <w:start w:val="1"/>
+      <w:numFmt w:val="decimal"/>
+      <w:lvlText w:val="%9."/>
+      <w:lvlJc w:val="left"/>
+      <w:pPr>
+        <w:tabs>
+          <w:tab w:val="num" w:pos="6480"/>
+        </w:tabs>
+        <w:ind w:left="6480" w:hanging="360"/>
+      </w:pPr>
+    </w:lvl>
+  </w:abstractNum>
+  <w:abstractNum w:abstractNumId="4" w15:restartNumberingAfterBreak="0">
     <w:nsid w:val="3EC018D9"/>
     <w:multiLevelType w:val="multilevel"/>
     <w:tmpl w:val="D2242944"/>
@@ -380,7 +2053,233 @@
       </w:rPr>
     </w:lvl>
   </w:abstractNum>
-  <w:abstractNum w:abstractNumId="1" w15:restartNumberingAfterBreak="0">
+  <w:abstractNum w:abstractNumId="5" w15:restartNumberingAfterBreak="0">
+    <w:nsid w:val="47CE7D09"/>
+    <w:multiLevelType w:val="multilevel"/>
+    <w:tmpl w:val="08C0F8DE"/>
+    <w:lvl w:ilvl="0">
+      <w:start w:val="1"/>
+      <w:numFmt w:val="decimal"/>
+      <w:lvlText w:val="%1."/>
+      <w:lvlJc w:val="left"/>
+      <w:pPr>
+        <w:tabs>
+          <w:tab w:val="num" w:pos="720"/>
+        </w:tabs>
+        <w:ind w:left="720" w:hanging="360"/>
+      </w:pPr>
+    </w:lvl>
+    <w:lvl w:ilvl="1" w:tentative="1">
+      <w:start w:val="1"/>
+      <w:numFmt w:val="decimal"/>
+      <w:lvlText w:val="%2."/>
+      <w:lvlJc w:val="left"/>
+      <w:pPr>
+        <w:tabs>
+          <w:tab w:val="num" w:pos="1440"/>
+        </w:tabs>
+        <w:ind w:left="1440" w:hanging="360"/>
+      </w:pPr>
+    </w:lvl>
+    <w:lvl w:ilvl="2" w:tentative="1">
+      <w:start w:val="1"/>
+      <w:numFmt w:val="decimal"/>
+      <w:lvlText w:val="%3."/>
+      <w:lvlJc w:val="left"/>
+      <w:pPr>
+        <w:tabs>
+          <w:tab w:val="num" w:pos="2160"/>
+        </w:tabs>
+        <w:ind w:left="2160" w:hanging="360"/>
+      </w:pPr>
+    </w:lvl>
+    <w:lvl w:ilvl="3" w:tentative="1">
+      <w:start w:val="1"/>
+      <w:numFmt w:val="decimal"/>
+      <w:lvlText w:val="%4."/>
+      <w:lvlJc w:val="left"/>
+      <w:pPr>
+        <w:tabs>
+          <w:tab w:val="num" w:pos="2880"/>
+        </w:tabs>
+        <w:ind w:left="2880" w:hanging="360"/>
+      </w:pPr>
+    </w:lvl>
+    <w:lvl w:ilvl="4" w:tentative="1">
+      <w:start w:val="1"/>
+      <w:numFmt w:val="decimal"/>
+      <w:lvlText w:val="%5."/>
+      <w:lvlJc w:val="left"/>
+      <w:pPr>
+        <w:tabs>
+          <w:tab w:val="num" w:pos="3600"/>
+        </w:tabs>
+        <w:ind w:left="3600" w:hanging="360"/>
+      </w:pPr>
+    </w:lvl>
+    <w:lvl w:ilvl="5" w:tentative="1">
+      <w:start w:val="1"/>
+      <w:numFmt w:val="decimal"/>
+      <w:lvlText w:val="%6."/>
+      <w:lvlJc w:val="left"/>
+      <w:pPr>
+        <w:tabs>
+          <w:tab w:val="num" w:pos="4320"/>
+        </w:tabs>
+        <w:ind w:left="4320" w:hanging="360"/>
+      </w:pPr>
+    </w:lvl>
+    <w:lvl w:ilvl="6" w:tentative="1">
+      <w:start w:val="1"/>
+      <w:numFmt w:val="decimal"/>
+      <w:lvlText w:val="%7."/>
+      <w:lvlJc w:val="left"/>
+      <w:pPr>
+        <w:tabs>
+          <w:tab w:val="num" w:pos="5040"/>
+        </w:tabs>
+        <w:ind w:left="5040" w:hanging="360"/>
+      </w:pPr>
+    </w:lvl>
+    <w:lvl w:ilvl="7" w:tentative="1">
+      <w:start w:val="1"/>
+      <w:numFmt w:val="decimal"/>
+      <w:lvlText w:val="%8."/>
+      <w:lvlJc w:val="left"/>
+      <w:pPr>
+        <w:tabs>
+          <w:tab w:val="num" w:pos="5760"/>
+        </w:tabs>
+        <w:ind w:left="5760" w:hanging="360"/>
+      </w:pPr>
+    </w:lvl>
+    <w:lvl w:ilvl="8" w:tentative="1">
+      <w:start w:val="1"/>
+      <w:numFmt w:val="decimal"/>
+      <w:lvlText w:val="%9."/>
+      <w:lvlJc w:val="left"/>
+      <w:pPr>
+        <w:tabs>
+          <w:tab w:val="num" w:pos="6480"/>
+        </w:tabs>
+        <w:ind w:left="6480" w:hanging="360"/>
+      </w:pPr>
+    </w:lvl>
+  </w:abstractNum>
+  <w:abstractNum w:abstractNumId="6" w15:restartNumberingAfterBreak="0">
+    <w:nsid w:val="47F00429"/>
+    <w:multiLevelType w:val="multilevel"/>
+    <w:tmpl w:val="82661526"/>
+    <w:lvl w:ilvl="0">
+      <w:start w:val="1"/>
+      <w:numFmt w:val="decimal"/>
+      <w:lvlText w:val="%1."/>
+      <w:lvlJc w:val="left"/>
+      <w:pPr>
+        <w:tabs>
+          <w:tab w:val="num" w:pos="720"/>
+        </w:tabs>
+        <w:ind w:left="720" w:hanging="360"/>
+      </w:pPr>
+    </w:lvl>
+    <w:lvl w:ilvl="1" w:tentative="1">
+      <w:start w:val="1"/>
+      <w:numFmt w:val="decimal"/>
+      <w:lvlText w:val="%2."/>
+      <w:lvlJc w:val="left"/>
+      <w:pPr>
+        <w:tabs>
+          <w:tab w:val="num" w:pos="1440"/>
+        </w:tabs>
+        <w:ind w:left="1440" w:hanging="360"/>
+      </w:pPr>
+    </w:lvl>
+    <w:lvl w:ilvl="2" w:tentative="1">
+      <w:start w:val="1"/>
+      <w:numFmt w:val="decimal"/>
+      <w:lvlText w:val="%3."/>
+      <w:lvlJc w:val="left"/>
+      <w:pPr>
+        <w:tabs>
+          <w:tab w:val="num" w:pos="2160"/>
+        </w:tabs>
+        <w:ind w:left="2160" w:hanging="360"/>
+      </w:pPr>
+    </w:lvl>
+    <w:lvl w:ilvl="3" w:tentative="1">
+      <w:start w:val="1"/>
+      <w:numFmt w:val="decimal"/>
+      <w:lvlText w:val="%4."/>
+      <w:lvlJc w:val="left"/>
+      <w:pPr>
+        <w:tabs>
+          <w:tab w:val="num" w:pos="2880"/>
+        </w:tabs>
+        <w:ind w:left="2880" w:hanging="360"/>
+      </w:pPr>
+    </w:lvl>
+    <w:lvl w:ilvl="4" w:tentative="1">
+      <w:start w:val="1"/>
+      <w:numFmt w:val="decimal"/>
+      <w:lvlText w:val="%5."/>
+      <w:lvlJc w:val="left"/>
+      <w:pPr>
+        <w:tabs>
+          <w:tab w:val="num" w:pos="3600"/>
+        </w:tabs>
+        <w:ind w:left="3600" w:hanging="360"/>
+      </w:pPr>
+    </w:lvl>
+    <w:lvl w:ilvl="5" w:tentative="1">
+      <w:start w:val="1"/>
+      <w:numFmt w:val="decimal"/>
+      <w:lvlText w:val="%6."/>
+      <w:lvlJc w:val="left"/>
+      <w:pPr>
+        <w:tabs>
+          <w:tab w:val="num" w:pos="4320"/>
+        </w:tabs>
+        <w:ind w:left="4320" w:hanging="360"/>
+      </w:pPr>
+    </w:lvl>
+    <w:lvl w:ilvl="6" w:tentative="1">
+      <w:start w:val="1"/>
+      <w:numFmt w:val="decimal"/>
+      <w:lvlText w:val="%7."/>
+      <w:lvlJc w:val="left"/>
+      <w:pPr>
+        <w:tabs>
+          <w:tab w:val="num" w:pos="5040"/>
+        </w:tabs>
+        <w:ind w:left="5040" w:hanging="360"/>
+      </w:pPr>
+    </w:lvl>
+    <w:lvl w:ilvl="7" w:tentative="1">
+      <w:start w:val="1"/>
+      <w:numFmt w:val="decimal"/>
+      <w:lvlText w:val="%8."/>
+      <w:lvlJc w:val="left"/>
+      <w:pPr>
+        <w:tabs>
+          <w:tab w:val="num" w:pos="5760"/>
+        </w:tabs>
+        <w:ind w:left="5760" w:hanging="360"/>
+      </w:pPr>
+    </w:lvl>
+    <w:lvl w:ilvl="8" w:tentative="1">
+      <w:start w:val="1"/>
+      <w:numFmt w:val="decimal"/>
+      <w:lvlText w:val="%9."/>
+      <w:lvlJc w:val="left"/>
+      <w:pPr>
+        <w:tabs>
+          <w:tab w:val="num" w:pos="6480"/>
+        </w:tabs>
+        <w:ind w:left="6480" w:hanging="360"/>
+      </w:pPr>
+    </w:lvl>
+  </w:abstractNum>
+  <w:abstractNum w:abstractNumId="7" w15:restartNumberingAfterBreak="0">
     <w:nsid w:val="65610E1C"/>
     <w:multiLevelType w:val="multilevel"/>
     <w:tmpl w:val="09183CEA"/>
@@ -529,7 +2428,120 @@
       </w:rPr>
     </w:lvl>
   </w:abstractNum>
-  <w:abstractNum w:abstractNumId="2" w15:restartNumberingAfterBreak="0">
+  <w:abstractNum w:abstractNumId="8" w15:restartNumberingAfterBreak="0">
+    <w:nsid w:val="76317C2B"/>
+    <w:multiLevelType w:val="multilevel"/>
+    <w:tmpl w:val="B3705C0E"/>
+    <w:lvl w:ilvl="0">
+      <w:start w:val="31"/>
+      <w:numFmt w:val="decimal"/>
+      <w:lvlText w:val="%1."/>
+      <w:lvlJc w:val="left"/>
+      <w:pPr>
+        <w:tabs>
+          <w:tab w:val="num" w:pos="720"/>
+        </w:tabs>
+        <w:ind w:left="720" w:hanging="360"/>
+      </w:pPr>
+    </w:lvl>
+    <w:lvl w:ilvl="1" w:tentative="1">
+      <w:start w:val="1"/>
+      <w:numFmt w:val="decimal"/>
+      <w:lvlText w:val="%2."/>
+      <w:lvlJc w:val="left"/>
+      <w:pPr>
+        <w:tabs>
+          <w:tab w:val="num" w:pos="1440"/>
+        </w:tabs>
+        <w:ind w:left="1440" w:hanging="360"/>
+      </w:pPr>
+    </w:lvl>
+    <w:lvl w:ilvl="2" w:tentative="1">
+      <w:start w:val="1"/>
+      <w:numFmt w:val="decimal"/>
+      <w:lvlText w:val="%3."/>
+      <w:lvlJc w:val="left"/>
+      <w:pPr>
+        <w:tabs>
+          <w:tab w:val="num" w:pos="2160"/>
+        </w:tabs>
+        <w:ind w:left="2160" w:hanging="360"/>
+      </w:pPr>
+    </w:lvl>
+    <w:lvl w:ilvl="3" w:tentative="1">
+      <w:start w:val="1"/>
+      <w:numFmt w:val="decimal"/>
+      <w:lvlText w:val="%4."/>
+      <w:lvlJc w:val="left"/>
+      <w:pPr>
+        <w:tabs>
+          <w:tab w:val="num" w:pos="2880"/>
+        </w:tabs>
+        <w:ind w:left="2880" w:hanging="360"/>
+      </w:pPr>
+    </w:lvl>
+    <w:lvl w:ilvl="4" w:tentative="1">
+      <w:start w:val="1"/>
+      <w:numFmt w:val="decimal"/>
+      <w:lvlText w:val="%5."/>
+      <w:lvlJc w:val="left"/>
+      <w:pPr>
+        <w:tabs>
+          <w:tab w:val="num" w:pos="3600"/>
+        </w:tabs>
+        <w:ind w:left="3600" w:hanging="360"/>
+      </w:pPr>
+    </w:lvl>
+    <w:lvl w:ilvl="5" w:tentative="1">
+      <w:start w:val="1"/>
+      <w:numFmt w:val="decimal"/>
+      <w:lvlText w:val="%6."/>
+      <w:lvlJc w:val="left"/>
+      <w:pPr>
+        <w:tabs>
+          <w:tab w:val="num" w:pos="4320"/>
+        </w:tabs>
+        <w:ind w:left="4320" w:hanging="360"/>
+      </w:pPr>
+    </w:lvl>
+    <w:lvl w:ilvl="6" w:tentative="1">
+      <w:start w:val="1"/>
+      <w:numFmt w:val="decimal"/>
+      <w:lvlText w:val="%7."/>
+      <w:lvlJc w:val="left"/>
+      <w:pPr>
+        <w:tabs>
+          <w:tab w:val="num" w:pos="5040"/>
+        </w:tabs>
+        <w:ind w:left="5040" w:hanging="360"/>
+      </w:pPr>
+    </w:lvl>
+    <w:lvl w:ilvl="7" w:tentative="1">
+      <w:start w:val="1"/>
+      <w:numFmt w:val="decimal"/>
+      <w:lvlText w:val="%8."/>
+      <w:lvlJc w:val="left"/>
+      <w:pPr>
+        <w:tabs>
+          <w:tab w:val="num" w:pos="5760"/>
+        </w:tabs>
+        <w:ind w:left="5760" w:hanging="360"/>
+      </w:pPr>
+    </w:lvl>
+    <w:lvl w:ilvl="8" w:tentative="1">
+      <w:start w:val="1"/>
+      <w:numFmt w:val="decimal"/>
+      <w:lvlText w:val="%9."/>
+      <w:lvlJc w:val="left"/>
+      <w:pPr>
+        <w:tabs>
+          <w:tab w:val="num" w:pos="6480"/>
+        </w:tabs>
+        <w:ind w:left="6480" w:hanging="360"/>
+      </w:pPr>
+    </w:lvl>
+  </w:abstractNum>
+  <w:abstractNum w:abstractNumId="9" w15:restartNumberingAfterBreak="0">
     <w:nsid w:val="7A8B7BEE"/>
     <w:multiLevelType w:val="multilevel"/>
     <w:tmpl w:val="6B948BC2"/>
@@ -679,40 +2691,34 @@
     </w:lvl>
   </w:abstractNum>
   <w:num w:numId="1" w16cid:durableId="406995072">
-    <w:abstractNumId w:val="0"/>
-    <w:lvlOverride w:ilvl="0"/>
-    <w:lvlOverride w:ilvl="1"/>
-    <w:lvlOverride w:ilvl="2"/>
-    <w:lvlOverride w:ilvl="3"/>
-    <w:lvlOverride w:ilvl="4"/>
-    <w:lvlOverride w:ilvl="5"/>
-    <w:lvlOverride w:ilvl="6"/>
-    <w:lvlOverride w:ilvl="7"/>
-    <w:lvlOverride w:ilvl="8"/>
+    <w:abstractNumId w:val="4"/>
   </w:num>
   <w:num w:numId="2" w16cid:durableId="504365550">
-    <w:abstractNumId w:val="1"/>
-    <w:lvlOverride w:ilvl="0"/>
-    <w:lvlOverride w:ilvl="1"/>
-    <w:lvlOverride w:ilvl="2"/>
-    <w:lvlOverride w:ilvl="3"/>
-    <w:lvlOverride w:ilvl="4"/>
-    <w:lvlOverride w:ilvl="5"/>
-    <w:lvlOverride w:ilvl="6"/>
-    <w:lvlOverride w:ilvl="7"/>
-    <w:lvlOverride w:ilvl="8"/>
+    <w:abstractNumId w:val="7"/>
   </w:num>
   <w:num w:numId="3" w16cid:durableId="59795803">
+    <w:abstractNumId w:val="9"/>
+  </w:num>
+  <w:num w:numId="4" w16cid:durableId="130561819">
+    <w:abstractNumId w:val="0"/>
+  </w:num>
+  <w:num w:numId="5" w16cid:durableId="138422267">
+    <w:abstractNumId w:val="5"/>
+  </w:num>
+  <w:num w:numId="6" w16cid:durableId="1705906200">
+    <w:abstractNumId w:val="6"/>
+  </w:num>
+  <w:num w:numId="7" w16cid:durableId="1967075531">
+    <w:abstractNumId w:val="1"/>
+  </w:num>
+  <w:num w:numId="8" w16cid:durableId="1828591198">
     <w:abstractNumId w:val="2"/>
-    <w:lvlOverride w:ilvl="0"/>
-    <w:lvlOverride w:ilvl="1"/>
-    <w:lvlOverride w:ilvl="2"/>
-    <w:lvlOverride w:ilvl="3"/>
-    <w:lvlOverride w:ilvl="4"/>
-    <w:lvlOverride w:ilvl="5"/>
-    <w:lvlOverride w:ilvl="6"/>
-    <w:lvlOverride w:ilvl="7"/>
-    <w:lvlOverride w:ilvl="8"/>
+  </w:num>
+  <w:num w:numId="9" w16cid:durableId="69668520">
+    <w:abstractNumId w:val="3"/>
+  </w:num>
+  <w:num w:numId="10" w16cid:durableId="1012314">
+    <w:abstractNumId w:val="8"/>
   </w:num>
 </w:numbering>
 </file>
@@ -1175,7 +3181,6 @@
     <w:next w:val="Normal"/>
     <w:link w:val="Heading3Char"/>
     <w:uiPriority w:val="9"/>
-    <w:semiHidden/>
     <w:unhideWhenUsed/>
     <w:qFormat/>
     <w:rsid w:val="0049572D"/>
@@ -1327,6 +3332,7 @@
   <w:style w:type="character" w:default="1" w:styleId="DefaultParagraphFont">
     <w:name w:val="Default Paragraph Font"/>
     <w:uiPriority w:val="1"/>
+    <w:semiHidden/>
     <w:unhideWhenUsed/>
   </w:style>
   <w:style w:type="table" w:default="1" w:styleId="TableNormal">
@@ -1384,7 +3390,6 @@
     <w:basedOn w:val="DefaultParagraphFont"/>
     <w:link w:val="Heading3"/>
     <w:uiPriority w:val="9"/>
-    <w:semiHidden/>
     <w:rsid w:val="0049572D"/>
     <w:rPr>
       <w:rFonts w:eastAsiaTheme="majorEastAsia" w:cstheme="majorBidi"/>
@@ -1653,6 +3658,36 @@
       <w:smallCaps/>
       <w:color w:val="2F5496" w:themeColor="accent1" w:themeShade="BF"/>
       <w:spacing w:val="5"/>
+    </w:rPr>
+  </w:style>
+  <w:style w:type="paragraph" w:styleId="NormalWeb">
+    <w:name w:val="Normal (Web)"/>
+    <w:basedOn w:val="Normal"/>
+    <w:uiPriority w:val="99"/>
+    <w:semiHidden/>
+    <w:unhideWhenUsed/>
+    <w:rsid w:val="00DC0725"/>
+    <w:pPr>
+      <w:spacing w:before="100" w:beforeAutospacing="1" w:after="100" w:afterAutospacing="1" w:line="240" w:lineRule="auto"/>
+    </w:pPr>
+    <w:rPr>
+      <w:rFonts w:ascii="Times New Roman" w:eastAsia="Times New Roman" w:hAnsi="Times New Roman" w:cs="Times New Roman"/>
+      <w:noProof w:val="0"/>
+      <w:kern w:val="0"/>
+      <w:sz w:val="24"/>
+      <w:szCs w:val="24"/>
+      <w14:ligatures w14:val="none"/>
+    </w:rPr>
+  </w:style>
+  <w:style w:type="character" w:styleId="Strong">
+    <w:name w:val="Strong"/>
+    <w:basedOn w:val="DefaultParagraphFont"/>
+    <w:uiPriority w:val="22"/>
+    <w:qFormat/>
+    <w:rsid w:val="00DC0725"/>
+    <w:rPr>
+      <w:b/>
+      <w:bCs/>
     </w:rPr>
   </w:style>
 </w:styles>

</xml_diff>